<commit_message>
RTpred docs: name the RTpred code and note the pre-trained models
In the tool tables the mdcc row becomes "RTpred (SNU food metabolomics lab,
code name mdcc)", Revision 2, with the Retip method paper as the source (no
public repository). As SNU asked, a short note says that the predict and
compare images hold the RP and HILIC default models pre-trained by the lab
(/opt/mdcc/models) and that the train image holds none. The 2026-10-23
release folder (not yet deployed) is rebuilt with these docs; the release
scripts are unchanged.

Co-Authored-By: Claude Opus 5.5 <noreply@anthropic.com>
</commit_message>
<xml_diff>
--- a/docs/RTpred/modules/Portal_Content.docx
+++ b/docs/RTpred/modules/Portal_Content.docx
@@ -2176,7 +2176,7 @@
                 <w:sz w:val="18"/>
                 <w:szCs w:val="18"/>
               </w:rPr>
-              <w:t xml:space="preserve">mdcc (RTpred 코드, 서울대 식품대사체학 연구실)</w:t>
+              <w:t xml:space="preserve">RTpred (서울대학교 식품대사체학 연구실 개발, 코드명 mdcc)</w:t>
             </w:r>
           </w:p>
         </w:tc>
@@ -2216,7 +2216,7 @@
                 <w:sz w:val="18"/>
                 <w:szCs w:val="18"/>
               </w:rPr>
-              <w:t xml:space="preserve">-</w:t>
+              <w:t xml:space="preserve">공개 저장소 없음(이미지에 포함). 방법 출처(Retip): https://doi.org/10.1021/acs.analchem.9b05765</w:t>
             </w:r>
           </w:p>
         </w:tc>
@@ -2237,10 +2237,16 @@
           <w:b/>
           <w:bCs/>
         </w:rPr>
-        <w:t xml:space="preserve">태그(키워드):</w:t>
-      </w:r>
-      <w:r>
-        <w:t xml:space="preserve"> 머무름시간예측, 대사체동정, RDKit, AutoGluon</w:t>
+        <w:t xml:space="preserve">내장 모델:</w:t>
+      </w:r>
+      <w:r>
+        <w:t xml:space="preserve"> 이 이미지에는 서울대학교 식품대사체학 연구실이 사전 학습한 RP·HILIC 기본 모델(best: WeightedEnsemble_L3, RT 단위 분)이 </w:t>
+      </w:r>
+      <w:r>
+        <w:t xml:space="preserve">/opt/mdcc/models</w:t>
+      </w:r>
+      <w:r>
+        <w:t xml:space="preserve">에 들어 있으며, 기본 모델 예측과 비교에 쓰입니다.</w:t>
       </w:r>
     </w:p>
     <w:p>
@@ -2257,16 +2263,16 @@
           <w:b/>
           <w:bCs/>
         </w:rPr>
-        <w:t xml:space="preserve">내용(국문):</w:t>
-      </w:r>
-      <w:r>
-        <w:t xml:space="preserve"> 화합물 구조(SMILES)로 액체크로마토그래피 머무름 시간(RT)을 예측하는 실행 환경입니다. RDKit으로 구조 descriptor를 계산하고 AutoGluon 모델로 예측·학습합니다. RP·HILIC 기본 모델(best: WeightedEnsemble_L3)이 이미지 안 </w:t>
+        <w:t xml:space="preserve">Bundled models:</w:t>
+      </w:r>
+      <w:r>
+        <w:t xml:space="preserve"> this image holds the RP and HILIC default models pre-trained by the SNU food metabolomics lab (best: WeightedEnsemble_L3, RT in minutes) in </w:t>
       </w:r>
       <w:r>
         <w:t xml:space="preserve">/opt/mdcc/models</w:t>
       </w:r>
       <w:r>
-        <w:t xml:space="preserve">에 들어 있습니다. 실행 중 인터넷과 GPU를 쓰지 않습니다.</w:t>
+        <w:t xml:space="preserve">, used for default prediction and comparison.</w:t>
       </w:r>
     </w:p>
     <w:p>
@@ -2283,10 +2289,56 @@
           <w:b/>
           <w:bCs/>
         </w:rPr>
+        <w:t xml:space="preserve">태그(키워드):</w:t>
+      </w:r>
+      <w:r>
+        <w:t xml:space="preserve"> 머무름시간예측, 대사체동정, RDKit, AutoGluon</w:t>
+      </w:r>
+    </w:p>
+    <w:p>
+      <w:pPr>
+        <w:pStyle w:val="ListParagraph"/>
+        <w:numPr>
+          <w:ilvl w:val="0"/>
+          <w:numId w:val="2"/>
+        </w:numPr>
+        <w:spacing w:after="80"/>
+      </w:pPr>
+      <w:r>
+        <w:rPr>
+          <w:b/>
+          <w:bCs/>
+        </w:rPr>
+        <w:t xml:space="preserve">내용(국문):</w:t>
+      </w:r>
+      <w:r>
+        <w:t xml:space="preserve"> 화합물 구조(SMILES)로 액체크로마토그래피 머무름 시간(RT)을 예측하는 실행 환경입니다. RDKit으로 구조 descriptor를 계산하고 AutoGluon 모델로 예측·학습합니다. 사전 학습된 RP·HILIC 기본 모델(best: WeightedEnsemble_L3)이 이미지 안 </w:t>
+      </w:r>
+      <w:r>
+        <w:t xml:space="preserve">/opt/mdcc/models</w:t>
+      </w:r>
+      <w:r>
+        <w:t xml:space="preserve">에 들어 있습니다. 실행 중 인터넷과 GPU를 쓰지 않습니다.</w:t>
+      </w:r>
+    </w:p>
+    <w:p>
+      <w:pPr>
+        <w:pStyle w:val="ListParagraph"/>
+        <w:numPr>
+          <w:ilvl w:val="0"/>
+          <w:numId w:val="2"/>
+        </w:numPr>
+        <w:spacing w:after="80"/>
+      </w:pPr>
+      <w:r>
+        <w:rPr>
+          <w:b/>
+          <w:bCs/>
+        </w:rPr>
         <w:t xml:space="preserve">내용(영문):</w:t>
       </w:r>
       <w:r>
-        <w:t xml:space="preserve"> Runtime environment for predicting liquid chromatography retention time (RT) from compound structures (SMILES). RDKit computes structure descriptors and AutoGluon models predict and train. The default RP and HILIC models (best: WeightedEnsemble_L3) are bundled in </w:t>
+        <w:t xml:space="preserve"> Runtime environment for predicting liquid chromatography retention time (RT) from compound structures (SMILES). RDKit computes structure descriptors and AutoGluon models predict and train. Pre-trained default RP and HILIC models (best: WeightedEnsemble_L3) are bundled in </w:t>
       </w:r>
       <w:r>
         <w:t xml:space="preserve">/opt/mdcc/models</w:t>
@@ -6315,7 +6367,7 @@
                 <w:sz w:val="18"/>
                 <w:szCs w:val="18"/>
               </w:rPr>
-              <w:t xml:space="preserve">mdcc (RTpred 코드, 서울대 식품대사체학 연구실)</w:t>
+              <w:t xml:space="preserve">RTpred (서울대학교 식품대사체학 연구실 개발, 코드명 mdcc)</w:t>
             </w:r>
           </w:p>
         </w:tc>
@@ -6355,13 +6407,53 @@
                 <w:sz w:val="18"/>
                 <w:szCs w:val="18"/>
               </w:rPr>
-              <w:t xml:space="preserve">-</w:t>
+              <w:t xml:space="preserve">공개 저장소 없음(이미지에 포함). 방법 출처(Retip): https://doi.org/10.1021/acs.analchem.9b05765</w:t>
             </w:r>
           </w:p>
         </w:tc>
       </w:tr>
     </w:tbl>
     <w:p/>
+    <w:p>
+      <w:pPr>
+        <w:pStyle w:val="ListParagraph"/>
+        <w:numPr>
+          <w:ilvl w:val="0"/>
+          <w:numId w:val="2"/>
+        </w:numPr>
+        <w:spacing w:after="80"/>
+      </w:pPr>
+      <w:r>
+        <w:rPr>
+          <w:b/>
+          <w:bCs/>
+        </w:rPr>
+        <w:t xml:space="preserve">내장 모델:</w:t>
+      </w:r>
+      <w:r>
+        <w:t xml:space="preserve"> 이 이미지에는 사전 학습 모델이 들어 있지 않습니다(학습 전용).</w:t>
+      </w:r>
+    </w:p>
+    <w:p>
+      <w:pPr>
+        <w:pStyle w:val="ListParagraph"/>
+        <w:numPr>
+          <w:ilvl w:val="0"/>
+          <w:numId w:val="2"/>
+        </w:numPr>
+        <w:spacing w:after="80"/>
+      </w:pPr>
+      <w:r>
+        <w:rPr>
+          <w:b/>
+          <w:bCs/>
+        </w:rPr>
+        <w:t xml:space="preserve">Bundled models:</w:t>
+      </w:r>
+      <w:r>
+        <w:t xml:space="preserve"> this image holds no pre-trained models (training only).</w:t>
+      </w:r>
+    </w:p>
     <w:p>
       <w:pPr>
         <w:pStyle w:val="ListParagraph"/>
@@ -11750,7 +11842,7 @@
                 <w:sz w:val="18"/>
                 <w:szCs w:val="18"/>
               </w:rPr>
-              <w:t xml:space="preserve">mdcc (RTpred 코드, 서울대 식품대사체학 연구실)</w:t>
+              <w:t xml:space="preserve">RTpred (서울대학교 식품대사체학 연구실 개발, 코드명 mdcc)</w:t>
             </w:r>
           </w:p>
         </w:tc>
@@ -11790,7 +11882,7 @@
                 <w:sz w:val="18"/>
                 <w:szCs w:val="18"/>
               </w:rPr>
-              <w:t xml:space="preserve">-</w:t>
+              <w:t xml:space="preserve">공개 저장소 없음(이미지에 포함). 방법 출처(Retip): https://doi.org/10.1021/acs.analchem.9b05765</w:t>
             </w:r>
           </w:p>
         </w:tc>
@@ -11811,10 +11903,16 @@
           <w:b/>
           <w:bCs/>
         </w:rPr>
-        <w:t xml:space="preserve">태그(키워드):</w:t>
-      </w:r>
-      <w:r>
-        <w:t xml:space="preserve"> 머무름시간예측, 대사체동정, RDKit, AutoGluon</w:t>
+        <w:t xml:space="preserve">내장 모델:</w:t>
+      </w:r>
+      <w:r>
+        <w:t xml:space="preserve"> 이 이미지에는 서울대학교 식품대사체학 연구실이 사전 학습한 RP·HILIC 기본 모델(best: WeightedEnsemble_L3, RT 단위 분)이 </w:t>
+      </w:r>
+      <w:r>
+        <w:t xml:space="preserve">/opt/mdcc/models</w:t>
+      </w:r>
+      <w:r>
+        <w:t xml:space="preserve">에 들어 있으며, 기본 모델 예측과 비교에 쓰입니다.</w:t>
       </w:r>
     </w:p>
     <w:p>
@@ -11831,16 +11929,16 @@
           <w:b/>
           <w:bCs/>
         </w:rPr>
-        <w:t xml:space="preserve">내용(국문):</w:t>
-      </w:r>
-      <w:r>
-        <w:t xml:space="preserve"> 화합물 구조(SMILES)로 액체크로마토그래피 머무름 시간(RT)을 예측하는 실행 환경입니다. RDKit으로 구조 descriptor를 계산하고 AutoGluon 모델로 예측·학습합니다. RP·HILIC 기본 모델(best: WeightedEnsemble_L3)이 이미지 안 </w:t>
+        <w:t xml:space="preserve">Bundled models:</w:t>
+      </w:r>
+      <w:r>
+        <w:t xml:space="preserve"> this image holds the RP and HILIC default models pre-trained by the SNU food metabolomics lab (best: WeightedEnsemble_L3, RT in minutes) in </w:t>
       </w:r>
       <w:r>
         <w:t xml:space="preserve">/opt/mdcc/models</w:t>
       </w:r>
       <w:r>
-        <w:t xml:space="preserve">에 들어 있습니다. 실행 중 인터넷과 GPU를 쓰지 않습니다.</w:t>
+        <w:t xml:space="preserve">, used for default prediction and comparison.</w:t>
       </w:r>
     </w:p>
     <w:p>
@@ -11857,10 +11955,56 @@
           <w:b/>
           <w:bCs/>
         </w:rPr>
+        <w:t xml:space="preserve">태그(키워드):</w:t>
+      </w:r>
+      <w:r>
+        <w:t xml:space="preserve"> 머무름시간예측, 대사체동정, RDKit, AutoGluon</w:t>
+      </w:r>
+    </w:p>
+    <w:p>
+      <w:pPr>
+        <w:pStyle w:val="ListParagraph"/>
+        <w:numPr>
+          <w:ilvl w:val="0"/>
+          <w:numId w:val="2"/>
+        </w:numPr>
+        <w:spacing w:after="80"/>
+      </w:pPr>
+      <w:r>
+        <w:rPr>
+          <w:b/>
+          <w:bCs/>
+        </w:rPr>
+        <w:t xml:space="preserve">내용(국문):</w:t>
+      </w:r>
+      <w:r>
+        <w:t xml:space="preserve"> 화합물 구조(SMILES)로 액체크로마토그래피 머무름 시간(RT)을 예측하는 실행 환경입니다. RDKit으로 구조 descriptor를 계산하고 AutoGluon 모델로 예측·학습합니다. 사전 학습된 RP·HILIC 기본 모델(best: WeightedEnsemble_L3)이 이미지 안 </w:t>
+      </w:r>
+      <w:r>
+        <w:t xml:space="preserve">/opt/mdcc/models</w:t>
+      </w:r>
+      <w:r>
+        <w:t xml:space="preserve">에 들어 있습니다. 실행 중 인터넷과 GPU를 쓰지 않습니다.</w:t>
+      </w:r>
+    </w:p>
+    <w:p>
+      <w:pPr>
+        <w:pStyle w:val="ListParagraph"/>
+        <w:numPr>
+          <w:ilvl w:val="0"/>
+          <w:numId w:val="2"/>
+        </w:numPr>
+        <w:spacing w:after="80"/>
+      </w:pPr>
+      <w:r>
+        <w:rPr>
+          <w:b/>
+          <w:bCs/>
+        </w:rPr>
         <w:t xml:space="preserve">내용(영문):</w:t>
       </w:r>
       <w:r>
-        <w:t xml:space="preserve"> Runtime environment for predicting liquid chromatography retention time (RT) from compound structures (SMILES). RDKit computes structure descriptors and AutoGluon models predict and train. The default RP and HILIC models (best: WeightedEnsemble_L3) are bundled in </w:t>
+        <w:t xml:space="preserve"> Runtime environment for predicting liquid chromatography retention time (RT) from compound structures (SMILES). RDKit computes structure descriptors and AutoGluon models predict and train. Pre-trained default RP and HILIC models (best: WeightedEnsemble_L3) are bundled in </w:t>
       </w:r>
       <w:r>
         <w:t xml:space="preserve">/opt/mdcc/models</w:t>

</xml_diff>

<commit_message>
RTpred docs: tool table shows RTpred 1.0 and its pre-trained models
The tool tables list "RTpred 1.0" and, for the predict and compare images,
"RTpred pre-trained models (RP, HILIC) 1.0", instead of the long row with
the lab name and "Revision 2" (an undocumented label of the SNU DEFs). The
notes under the tables are removed. Container_Manual keeps the delivery
label (Revision 2) as provenance. The 2026-10-23 release folder (not yet
deployed) is rebuilt; release scripts unchanged.

Co-Authored-By: Claude Opus 5.5 <noreply@anthropic.com>
</commit_message>
<xml_diff>
--- a/docs/RTpred/modules/Portal_Content.docx
+++ b/docs/RTpred/modules/Portal_Content.docx
@@ -2176,7 +2176,7 @@
                 <w:sz w:val="18"/>
                 <w:szCs w:val="18"/>
               </w:rPr>
-              <w:t xml:space="preserve">RTpred (서울대학교 식품대사체학 연구실 개발, 코드명 mdcc)</w:t>
+              <w:t xml:space="preserve">RTpred</w:t>
             </w:r>
           </w:p>
         </w:tc>
@@ -2196,7 +2196,7 @@
                 <w:sz w:val="18"/>
                 <w:szCs w:val="18"/>
               </w:rPr>
-              <w:t xml:space="preserve">Revision 2</w:t>
+              <w:t xml:space="preserve">1.0</w:t>
             </w:r>
           </w:p>
         </w:tc>
@@ -2216,65 +2216,75 @@
                 <w:sz w:val="18"/>
                 <w:szCs w:val="18"/>
               </w:rPr>
-              <w:t xml:space="preserve">공개 저장소 없음(이미지에 포함). 방법 출처(Retip): https://doi.org/10.1021/acs.analchem.9b05765</w:t>
+              <w:t xml:space="preserve">-</w:t>
+            </w:r>
+          </w:p>
+        </w:tc>
+      </w:tr>
+      <w:tr>
+        <w:tc>
+          <w:tcPr>
+            <w:tcW w:type="dxa" w:w="1800"/>
+            <w:tcMar>
+              <w:top w:type="dxa" w:w="60"/>
+              <w:left w:type="dxa" w:w="90"/>
+              <w:bottom w:type="dxa" w:w="60"/>
+              <w:right w:type="dxa" w:w="90"/>
+            </w:tcMar>
+          </w:tcPr>
+          <w:p>
+            <w:r>
+              <w:rPr>
+                <w:sz w:val="18"/>
+                <w:szCs w:val="18"/>
+              </w:rPr>
+              <w:t xml:space="preserve">RTpred 사전 학습 모델 (RP, HILIC)</w:t>
+            </w:r>
+          </w:p>
+        </w:tc>
+        <w:tc>
+          <w:tcPr>
+            <w:tcW w:type="dxa" w:w="3853"/>
+            <w:tcMar>
+              <w:top w:type="dxa" w:w="60"/>
+              <w:left w:type="dxa" w:w="90"/>
+              <w:bottom w:type="dxa" w:w="60"/>
+              <w:right w:type="dxa" w:w="90"/>
+            </w:tcMar>
+          </w:tcPr>
+          <w:p>
+            <w:r>
+              <w:rPr>
+                <w:sz w:val="18"/>
+                <w:szCs w:val="18"/>
+              </w:rPr>
+              <w:t xml:space="preserve">1.0</w:t>
+            </w:r>
+          </w:p>
+        </w:tc>
+        <w:tc>
+          <w:tcPr>
+            <w:tcW w:type="dxa" w:w="3853"/>
+            <w:tcMar>
+              <w:top w:type="dxa" w:w="60"/>
+              <w:left w:type="dxa" w:w="90"/>
+              <w:bottom w:type="dxa" w:w="60"/>
+              <w:right w:type="dxa" w:w="90"/>
+            </w:tcMar>
+          </w:tcPr>
+          <w:p>
+            <w:r>
+              <w:rPr>
+                <w:sz w:val="18"/>
+                <w:szCs w:val="18"/>
+              </w:rPr>
+              <w:t xml:space="preserve">-</w:t>
             </w:r>
           </w:p>
         </w:tc>
       </w:tr>
     </w:tbl>
     <w:p/>
-    <w:p>
-      <w:pPr>
-        <w:pStyle w:val="ListParagraph"/>
-        <w:numPr>
-          <w:ilvl w:val="0"/>
-          <w:numId w:val="2"/>
-        </w:numPr>
-        <w:spacing w:after="80"/>
-      </w:pPr>
-      <w:r>
-        <w:rPr>
-          <w:b/>
-          <w:bCs/>
-        </w:rPr>
-        <w:t xml:space="preserve">내장 모델:</w:t>
-      </w:r>
-      <w:r>
-        <w:t xml:space="preserve"> 이 이미지에는 서울대학교 식품대사체학 연구실이 사전 학습한 RP·HILIC 기본 모델(best: WeightedEnsemble_L3, RT 단위 분)이 </w:t>
-      </w:r>
-      <w:r>
-        <w:t xml:space="preserve">/opt/mdcc/models</w:t>
-      </w:r>
-      <w:r>
-        <w:t xml:space="preserve">에 들어 있으며, 기본 모델 예측과 비교에 쓰입니다.</w:t>
-      </w:r>
-    </w:p>
-    <w:p>
-      <w:pPr>
-        <w:pStyle w:val="ListParagraph"/>
-        <w:numPr>
-          <w:ilvl w:val="0"/>
-          <w:numId w:val="2"/>
-        </w:numPr>
-        <w:spacing w:after="80"/>
-      </w:pPr>
-      <w:r>
-        <w:rPr>
-          <w:b/>
-          <w:bCs/>
-        </w:rPr>
-        <w:t xml:space="preserve">Bundled models:</w:t>
-      </w:r>
-      <w:r>
-        <w:t xml:space="preserve"> this image holds the RP and HILIC default models pre-trained by the SNU food metabolomics lab (best: WeightedEnsemble_L3, RT in minutes) in </w:t>
-      </w:r>
-      <w:r>
-        <w:t xml:space="preserve">/opt/mdcc/models</w:t>
-      </w:r>
-      <w:r>
-        <w:t xml:space="preserve">, used for default prediction and comparison.</w:t>
-      </w:r>
-    </w:p>
     <w:p>
       <w:pPr>
         <w:pStyle w:val="ListParagraph"/>
@@ -6367,7 +6377,7 @@
                 <w:sz w:val="18"/>
                 <w:szCs w:val="18"/>
               </w:rPr>
-              <w:t xml:space="preserve">RTpred (서울대학교 식품대사체학 연구실 개발, 코드명 mdcc)</w:t>
+              <w:t xml:space="preserve">RTpred</w:t>
             </w:r>
           </w:p>
         </w:tc>
@@ -6387,7 +6397,7 @@
                 <w:sz w:val="18"/>
                 <w:szCs w:val="18"/>
               </w:rPr>
-              <w:t xml:space="preserve">Revision 2</w:t>
+              <w:t xml:space="preserve">1.0</w:t>
             </w:r>
           </w:p>
         </w:tc>
@@ -6407,53 +6417,13 @@
                 <w:sz w:val="18"/>
                 <w:szCs w:val="18"/>
               </w:rPr>
-              <w:t xml:space="preserve">공개 저장소 없음(이미지에 포함). 방법 출처(Retip): https://doi.org/10.1021/acs.analchem.9b05765</w:t>
+              <w:t xml:space="preserve">-</w:t>
             </w:r>
           </w:p>
         </w:tc>
       </w:tr>
     </w:tbl>
     <w:p/>
-    <w:p>
-      <w:pPr>
-        <w:pStyle w:val="ListParagraph"/>
-        <w:numPr>
-          <w:ilvl w:val="0"/>
-          <w:numId w:val="2"/>
-        </w:numPr>
-        <w:spacing w:after="80"/>
-      </w:pPr>
-      <w:r>
-        <w:rPr>
-          <w:b/>
-          <w:bCs/>
-        </w:rPr>
-        <w:t xml:space="preserve">내장 모델:</w:t>
-      </w:r>
-      <w:r>
-        <w:t xml:space="preserve"> 이 이미지에는 사전 학습 모델이 들어 있지 않습니다(학습 전용).</w:t>
-      </w:r>
-    </w:p>
-    <w:p>
-      <w:pPr>
-        <w:pStyle w:val="ListParagraph"/>
-        <w:numPr>
-          <w:ilvl w:val="0"/>
-          <w:numId w:val="2"/>
-        </w:numPr>
-        <w:spacing w:after="80"/>
-      </w:pPr>
-      <w:r>
-        <w:rPr>
-          <w:b/>
-          <w:bCs/>
-        </w:rPr>
-        <w:t xml:space="preserve">Bundled models:</w:t>
-      </w:r>
-      <w:r>
-        <w:t xml:space="preserve"> this image holds no pre-trained models (training only).</w:t>
-      </w:r>
-    </w:p>
     <w:p>
       <w:pPr>
         <w:pStyle w:val="ListParagraph"/>
@@ -11842,7 +11812,7 @@
                 <w:sz w:val="18"/>
                 <w:szCs w:val="18"/>
               </w:rPr>
-              <w:t xml:space="preserve">RTpred (서울대학교 식품대사체학 연구실 개발, 코드명 mdcc)</w:t>
+              <w:t xml:space="preserve">RTpred</w:t>
             </w:r>
           </w:p>
         </w:tc>
@@ -11862,7 +11832,7 @@
                 <w:sz w:val="18"/>
                 <w:szCs w:val="18"/>
               </w:rPr>
-              <w:t xml:space="preserve">Revision 2</w:t>
+              <w:t xml:space="preserve">1.0</w:t>
             </w:r>
           </w:p>
         </w:tc>
@@ -11882,65 +11852,75 @@
                 <w:sz w:val="18"/>
                 <w:szCs w:val="18"/>
               </w:rPr>
-              <w:t xml:space="preserve">공개 저장소 없음(이미지에 포함). 방법 출처(Retip): https://doi.org/10.1021/acs.analchem.9b05765</w:t>
+              <w:t xml:space="preserve">-</w:t>
+            </w:r>
+          </w:p>
+        </w:tc>
+      </w:tr>
+      <w:tr>
+        <w:tc>
+          <w:tcPr>
+            <w:tcW w:type="dxa" w:w="1800"/>
+            <w:tcMar>
+              <w:top w:type="dxa" w:w="60"/>
+              <w:left w:type="dxa" w:w="90"/>
+              <w:bottom w:type="dxa" w:w="60"/>
+              <w:right w:type="dxa" w:w="90"/>
+            </w:tcMar>
+          </w:tcPr>
+          <w:p>
+            <w:r>
+              <w:rPr>
+                <w:sz w:val="18"/>
+                <w:szCs w:val="18"/>
+              </w:rPr>
+              <w:t xml:space="preserve">RTpred 사전 학습 모델 (RP, HILIC)</w:t>
+            </w:r>
+          </w:p>
+        </w:tc>
+        <w:tc>
+          <w:tcPr>
+            <w:tcW w:type="dxa" w:w="3853"/>
+            <w:tcMar>
+              <w:top w:type="dxa" w:w="60"/>
+              <w:left w:type="dxa" w:w="90"/>
+              <w:bottom w:type="dxa" w:w="60"/>
+              <w:right w:type="dxa" w:w="90"/>
+            </w:tcMar>
+          </w:tcPr>
+          <w:p>
+            <w:r>
+              <w:rPr>
+                <w:sz w:val="18"/>
+                <w:szCs w:val="18"/>
+              </w:rPr>
+              <w:t xml:space="preserve">1.0</w:t>
+            </w:r>
+          </w:p>
+        </w:tc>
+        <w:tc>
+          <w:tcPr>
+            <w:tcW w:type="dxa" w:w="3853"/>
+            <w:tcMar>
+              <w:top w:type="dxa" w:w="60"/>
+              <w:left w:type="dxa" w:w="90"/>
+              <w:bottom w:type="dxa" w:w="60"/>
+              <w:right w:type="dxa" w:w="90"/>
+            </w:tcMar>
+          </w:tcPr>
+          <w:p>
+            <w:r>
+              <w:rPr>
+                <w:sz w:val="18"/>
+                <w:szCs w:val="18"/>
+              </w:rPr>
+              <w:t xml:space="preserve">-</w:t>
             </w:r>
           </w:p>
         </w:tc>
       </w:tr>
     </w:tbl>
     <w:p/>
-    <w:p>
-      <w:pPr>
-        <w:pStyle w:val="ListParagraph"/>
-        <w:numPr>
-          <w:ilvl w:val="0"/>
-          <w:numId w:val="2"/>
-        </w:numPr>
-        <w:spacing w:after="80"/>
-      </w:pPr>
-      <w:r>
-        <w:rPr>
-          <w:b/>
-          <w:bCs/>
-        </w:rPr>
-        <w:t xml:space="preserve">내장 모델:</w:t>
-      </w:r>
-      <w:r>
-        <w:t xml:space="preserve"> 이 이미지에는 서울대학교 식품대사체학 연구실이 사전 학습한 RP·HILIC 기본 모델(best: WeightedEnsemble_L3, RT 단위 분)이 </w:t>
-      </w:r>
-      <w:r>
-        <w:t xml:space="preserve">/opt/mdcc/models</w:t>
-      </w:r>
-      <w:r>
-        <w:t xml:space="preserve">에 들어 있으며, 기본 모델 예측과 비교에 쓰입니다.</w:t>
-      </w:r>
-    </w:p>
-    <w:p>
-      <w:pPr>
-        <w:pStyle w:val="ListParagraph"/>
-        <w:numPr>
-          <w:ilvl w:val="0"/>
-          <w:numId w:val="2"/>
-        </w:numPr>
-        <w:spacing w:after="80"/>
-      </w:pPr>
-      <w:r>
-        <w:rPr>
-          <w:b/>
-          <w:bCs/>
-        </w:rPr>
-        <w:t xml:space="preserve">Bundled models:</w:t>
-      </w:r>
-      <w:r>
-        <w:t xml:space="preserve"> this image holds the RP and HILIC default models pre-trained by the SNU food metabolomics lab (best: WeightedEnsemble_L3, RT in minutes) in </w:t>
-      </w:r>
-      <w:r>
-        <w:t xml:space="preserve">/opt/mdcc/models</w:t>
-      </w:r>
-      <w:r>
-        <w:t xml:space="preserve">, used for default prediction and comparison.</w:t>
-      </w:r>
-    </w:p>
     <w:p>
       <w:pPr>
         <w:pStyle w:val="ListParagraph"/>

</xml_diff>

<commit_message>
RTpred docs: sample sheet fields, model choice note, categories and tags
- Sample sheet sections follow the portal fields (title, body, example
  title and body, Korean and English): compound list for prediction,
  measured RT table for training, optional evaluation table.
- rtpred_predict key notes start with how the model is chosen (empty
  model_dir: pre-trained models in the image; a rtpred_train folder: that
  user model); user-facing text speaks of pre-trained models and RTpred
  instead of naming the lab.
- Module category Annotation / Metabolite_Annotation; tags add
  metabolomics, metabolite annotation, machine learning, cheminformatics.
- Pipeline: Metabolomics / Cheminformatics (from the developers'
  suggestion) and updated keywords.
Word files and the 2026-10-23 release folder (not yet deployed) rebuilt;
release scripts unchanged.

Co-Authored-By: Claude Opus 5.5 <noreply@anthropic.com>
</commit_message>
<xml_diff>
--- a/docs/RTpred/modules/Portal_Content.docx
+++ b/docs/RTpred/modules/Portal_Content.docx
@@ -326,7 +326,7 @@
         <w:spacing w:after="80"/>
       </w:pPr>
       <w:r>
-        <w:t xml:space="preserve">카테고리: CLOSHA 프로그램 목록에 맞는 중분류가 없어 Omics / Metabolite_Identification(신규)을 제안합니다. 머무름 시간 예측은 비표적 대사체 분석에서 후보 화합물을 거르는 데 쓰이며, 다른 대사체 동정 도구도 담을 수 있는 일반 이름입니다.</w:t>
+        <w:t xml:space="preserve">카테고리: 세 모듈 모두 Annotation / Metabolite_Annotation(신규)입니다. 머무름 시간 예측은 LC-MS 피크에 붙일 화합물 후보를 거르는 대사체 annotation 단계의 도구이며(Retip 논문 제목 "for Compound Annotation"), 대사체 분야에서 가장 흔한 표현을 썼습니다. 다른 대사체 동정·annotation 도구도 담을 수 있는 일반 이름입니다. 서울대가 제안한 화학정보학, 머신러닝은 태그에 넣었습니다.</w:t>
       </w:r>
     </w:p>
     <w:p>
@@ -707,27 +707,27 @@
                 <w:sz w:val="18"/>
                 <w:szCs w:val="18"/>
               </w:rPr>
-              <w:t xml:space="preserve">Omics</w:t>
-            </w:r>
-          </w:p>
-        </w:tc>
-        <w:tc>
-          <w:tcPr>
-            <w:tcW w:type="dxa" w:w="3853"/>
-            <w:tcMar>
-              <w:top w:type="dxa" w:w="60"/>
-              <w:left w:type="dxa" w:w="90"/>
-              <w:bottom w:type="dxa" w:w="60"/>
-              <w:right w:type="dxa" w:w="90"/>
-            </w:tcMar>
-          </w:tcPr>
-          <w:p>
-            <w:r>
-              <w:rPr>
-                <w:sz w:val="18"/>
-                <w:szCs w:val="18"/>
-              </w:rPr>
-              <w:t xml:space="preserve">Omics</w:t>
+              <w:t xml:space="preserve">Annotation</w:t>
+            </w:r>
+          </w:p>
+        </w:tc>
+        <w:tc>
+          <w:tcPr>
+            <w:tcW w:type="dxa" w:w="3853"/>
+            <w:tcMar>
+              <w:top w:type="dxa" w:w="60"/>
+              <w:left w:type="dxa" w:w="90"/>
+              <w:bottom w:type="dxa" w:w="60"/>
+              <w:right w:type="dxa" w:w="90"/>
+            </w:tcMar>
+          </w:tcPr>
+          <w:p>
+            <w:r>
+              <w:rPr>
+                <w:sz w:val="18"/>
+                <w:szCs w:val="18"/>
+              </w:rPr>
+              <w:t xml:space="preserve">Annotation</w:t>
             </w:r>
           </w:p>
         </w:tc>
@@ -769,27 +769,27 @@
                 <w:sz w:val="18"/>
                 <w:szCs w:val="18"/>
               </w:rPr>
-              <w:t xml:space="preserve">Metabolite_Identification (신규)</w:t>
-            </w:r>
-          </w:p>
-        </w:tc>
-        <w:tc>
-          <w:tcPr>
-            <w:tcW w:type="dxa" w:w="3853"/>
-            <w:tcMar>
-              <w:top w:type="dxa" w:w="60"/>
-              <w:left w:type="dxa" w:w="90"/>
-              <w:bottom w:type="dxa" w:w="60"/>
-              <w:right w:type="dxa" w:w="90"/>
-            </w:tcMar>
-          </w:tcPr>
-          <w:p>
-            <w:r>
-              <w:rPr>
-                <w:sz w:val="18"/>
-                <w:szCs w:val="18"/>
-              </w:rPr>
-              <w:t xml:space="preserve">Metabolite_Identification (new)</w:t>
+              <w:t xml:space="preserve">Metabolite_Annotation (신규)</w:t>
+            </w:r>
+          </w:p>
+        </w:tc>
+        <w:tc>
+          <w:tcPr>
+            <w:tcW w:type="dxa" w:w="3853"/>
+            <w:tcMar>
+              <w:top w:type="dxa" w:w="60"/>
+              <w:left w:type="dxa" w:w="90"/>
+              <w:bottom w:type="dxa" w:w="60"/>
+              <w:right w:type="dxa" w:w="90"/>
+            </w:tcMar>
+          </w:tcPr>
+          <w:p>
+            <w:r>
+              <w:rPr>
+                <w:sz w:val="18"/>
+                <w:szCs w:val="18"/>
+              </w:rPr>
+              <w:t xml:space="preserve">Metabolite_Annotation (new)</w:t>
             </w:r>
           </w:p>
         </w:tc>
@@ -831,7 +831,7 @@
                 <w:sz w:val="18"/>
                 <w:szCs w:val="18"/>
               </w:rPr>
-              <w:t xml:space="preserve">retention time, RT prediction, RP, HILIC, SMILES, RDKit, AutoGluon, metabolomics</w:t>
+              <w:t xml:space="preserve">retention time, RT prediction, metabolomics, metabolite annotation, RP, HILIC, SMILES, RDKit, AutoGluon, machine learning, cheminformatics</w:t>
             </w:r>
           </w:p>
         </w:tc>
@@ -3300,7 +3300,7 @@
     </w:p>
     <w:tbl>
       <w:tblPr>
-        <w:tblW w:type="dxa" w:w="9504"/>
+        <w:tblW w:type="dxa" w:w="9506"/>
         <w:tblBorders>
           <w:top w:val="single" w:color="auto" w:sz="4"/>
           <w:left w:val="single" w:color="auto" w:sz="4"/>
@@ -3311,15 +3311,14 @@
         </w:tblBorders>
       </w:tblPr>
       <w:tblGrid>
-        <w:gridCol w:w="2376"/>
-        <w:gridCol w:w="2376"/>
-        <w:gridCol w:w="2376"/>
-        <w:gridCol w:w="2376"/>
+        <w:gridCol w:w="1800"/>
+        <w:gridCol w:w="3853"/>
+        <w:gridCol w:w="3853"/>
       </w:tblGrid>
       <w:tr>
         <w:tc>
           <w:tcPr>
-            <w:tcW w:type="dxa" w:w="2376"/>
+            <w:tcW w:type="dxa" w:w="1800"/>
             <w:shd w:fill="E8EDF6" w:color="auto" w:val="clear"/>
             <w:tcMar>
               <w:top w:type="dxa" w:w="60"/>
@@ -3337,13 +3336,13 @@
                 <w:sz w:val="18"/>
                 <w:szCs w:val="18"/>
               </w:rPr>
-              <w:t xml:space="preserve">열</w:t>
-            </w:r>
-          </w:p>
-        </w:tc>
-        <w:tc>
-          <w:tcPr>
-            <w:tcW w:type="dxa" w:w="2376"/>
+              <w:t xml:space="preserve">칸</w:t>
+            </w:r>
+          </w:p>
+        </w:tc>
+        <w:tc>
+          <w:tcPr>
+            <w:tcW w:type="dxa" w:w="3853"/>
             <w:shd w:fill="E8EDF6" w:color="auto" w:val="clear"/>
             <w:tcMar>
               <w:top w:type="dxa" w:w="60"/>
@@ -3361,13 +3360,13 @@
                 <w:sz w:val="18"/>
                 <w:szCs w:val="18"/>
               </w:rPr>
-              <w:t xml:space="preserve">필수</w:t>
-            </w:r>
-          </w:p>
-        </w:tc>
-        <w:tc>
-          <w:tcPr>
-            <w:tcW w:type="dxa" w:w="2376"/>
+              <w:t xml:space="preserve">국문</w:t>
+            </w:r>
+          </w:p>
+        </w:tc>
+        <w:tc>
+          <w:tcPr>
+            <w:tcW w:type="dxa" w:w="3853"/>
             <w:shd w:fill="E8EDF6" w:color="auto" w:val="clear"/>
             <w:tcMar>
               <w:top w:type="dxa" w:w="60"/>
@@ -3385,31 +3384,7 @@
                 <w:sz w:val="18"/>
                 <w:szCs w:val="18"/>
               </w:rPr>
-              <w:t xml:space="preserve">설명</w:t>
-            </w:r>
-          </w:p>
-        </w:tc>
-        <w:tc>
-          <w:tcPr>
-            <w:tcW w:type="dxa" w:w="2376"/>
-            <w:shd w:fill="E8EDF6" w:color="auto" w:val="clear"/>
-            <w:tcMar>
-              <w:top w:type="dxa" w:w="60"/>
-              <w:left w:type="dxa" w:w="90"/>
-              <w:bottom w:type="dxa" w:w="60"/>
-              <w:right w:type="dxa" w:w="90"/>
-            </w:tcMar>
-          </w:tcPr>
-          <w:p>
-            <w:r>
-              <w:rPr>
-                <w:b/>
-                <w:bCs/>
-                <w:color w:val="32549C"/>
-                <w:sz w:val="18"/>
-                <w:szCs w:val="18"/>
-              </w:rPr>
-              <w:t xml:space="preserve">예시</w:t>
+              <w:t xml:space="preserve">영문</w:t>
             </w:r>
           </w:p>
         </w:tc>
@@ -3417,109 +3392,61 @@
       <w:tr>
         <w:tc>
           <w:tcPr>
-            <w:tcW w:type="dxa" w:w="2376"/>
-            <w:tcMar>
-              <w:top w:type="dxa" w:w="60"/>
-              <w:left w:type="dxa" w:w="90"/>
-              <w:bottom w:type="dxa" w:w="60"/>
-              <w:right w:type="dxa" w:w="90"/>
-            </w:tcMar>
-          </w:tcPr>
-          <w:p>
-            <w:r>
-              <w:rPr>
-                <w:sz w:val="18"/>
-                <w:szCs w:val="18"/>
-              </w:rPr>
-              <w:t xml:space="preserve">SMILES</w:t>
-            </w:r>
-          </w:p>
-        </w:tc>
-        <w:tc>
-          <w:tcPr>
-            <w:tcW w:type="dxa" w:w="2376"/>
-            <w:tcMar>
-              <w:top w:type="dxa" w:w="60"/>
-              <w:left w:type="dxa" w:w="90"/>
-              <w:bottom w:type="dxa" w:w="60"/>
-              <w:right w:type="dxa" w:w="90"/>
-            </w:tcMar>
-          </w:tcPr>
-          <w:p>
-            <w:r>
-              <w:rPr>
-                <w:sz w:val="18"/>
-                <w:szCs w:val="18"/>
-              </w:rPr>
-              <w:t xml:space="preserve">필수</w:t>
-            </w:r>
-          </w:p>
-        </w:tc>
-        <w:tc>
-          <w:tcPr>
-            <w:tcW w:type="dxa" w:w="2376"/>
-            <w:tcMar>
-              <w:top w:type="dxa" w:w="60"/>
-              <w:left w:type="dxa" w:w="90"/>
-              <w:bottom w:type="dxa" w:w="60"/>
-              <w:right w:type="dxa" w:w="90"/>
-            </w:tcMar>
-          </w:tcPr>
-          <w:p>
-            <w:r>
-              <w:rPr>
-                <w:sz w:val="18"/>
-                <w:szCs w:val="18"/>
-              </w:rPr>
-              <w:t xml:space="preserve">분자 구조 문자열(</w:t>
-            </w:r>
-            <w:r>
-              <w:rPr>
-                <w:sz w:val="18"/>
-                <w:szCs w:val="18"/>
-              </w:rPr>
-              <w:t xml:space="preserve">smiles</w:t>
-            </w:r>
-            <w:r>
-              <w:rPr>
-                <w:sz w:val="18"/>
-                <w:szCs w:val="18"/>
-              </w:rPr>
-              <w:t xml:space="preserve">, </w:t>
-            </w:r>
-            <w:r>
-              <w:rPr>
-                <w:sz w:val="18"/>
-                <w:szCs w:val="18"/>
-              </w:rPr>
-              <w:t xml:space="preserve">structure</w:t>
-            </w:r>
-            <w:r>
-              <w:rPr>
-                <w:sz w:val="18"/>
-                <w:szCs w:val="18"/>
-              </w:rPr>
-              <w:t xml:space="preserve">도 가능)</w:t>
-            </w:r>
-          </w:p>
-        </w:tc>
-        <w:tc>
-          <w:tcPr>
-            <w:tcW w:type="dxa" w:w="2376"/>
-            <w:tcMar>
-              <w:top w:type="dxa" w:w="60"/>
-              <w:left w:type="dxa" w:w="90"/>
-              <w:bottom w:type="dxa" w:w="60"/>
-              <w:right w:type="dxa" w:w="90"/>
-            </w:tcMar>
-          </w:tcPr>
-          <w:p>
-            <w:r>
-              <w:rPr>
-                <w:sz w:val="18"/>
-                <w:szCs w:val="18"/>
-              </w:rPr>
-              <w:t xml:space="preserve">O=C(O)c1ccccc1</w:t>
+            <w:tcW w:type="dxa" w:w="1800"/>
+            <w:tcMar>
+              <w:top w:type="dxa" w:w="60"/>
+              <w:left w:type="dxa" w:w="90"/>
+              <w:bottom w:type="dxa" w:w="60"/>
+              <w:right w:type="dxa" w:w="90"/>
+            </w:tcMar>
+          </w:tcPr>
+          <w:p>
+            <w:r>
+              <w:rPr>
+                <w:sz w:val="18"/>
+                <w:szCs w:val="18"/>
+              </w:rPr>
+              <w:t xml:space="preserve">샘플시트 제목</w:t>
+            </w:r>
+          </w:p>
+        </w:tc>
+        <w:tc>
+          <w:tcPr>
+            <w:tcW w:type="dxa" w:w="3853"/>
+            <w:tcMar>
+              <w:top w:type="dxa" w:w="60"/>
+              <w:left w:type="dxa" w:w="90"/>
+              <w:bottom w:type="dxa" w:w="60"/>
+              <w:right w:type="dxa" w:w="90"/>
+            </w:tcMar>
+          </w:tcPr>
+          <w:p>
+            <w:r>
+              <w:rPr>
+                <w:sz w:val="18"/>
+                <w:szCs w:val="18"/>
+              </w:rPr>
+              <w:t xml:space="preserve">예측할 화합물 목록</w:t>
+            </w:r>
+          </w:p>
+        </w:tc>
+        <w:tc>
+          <w:tcPr>
+            <w:tcW w:type="dxa" w:w="3853"/>
+            <w:tcMar>
+              <w:top w:type="dxa" w:w="60"/>
+              <w:left w:type="dxa" w:w="90"/>
+              <w:bottom w:type="dxa" w:w="60"/>
+              <w:right w:type="dxa" w:w="90"/>
+            </w:tcMar>
+          </w:tcPr>
+          <w:p>
+            <w:r>
+              <w:rPr>
+                <w:sz w:val="18"/>
+                <w:szCs w:val="18"/>
+              </w:rPr>
+              <w:t xml:space="preserve">Compound list for prediction</w:t>
             </w:r>
           </w:p>
         </w:tc>
@@ -3527,81 +3454,61 @@
       <w:tr>
         <w:tc>
           <w:tcPr>
-            <w:tcW w:type="dxa" w:w="2376"/>
-            <w:tcMar>
-              <w:top w:type="dxa" w:w="60"/>
-              <w:left w:type="dxa" w:w="90"/>
-              <w:bottom w:type="dxa" w:w="60"/>
-              <w:right w:type="dxa" w:w="90"/>
-            </w:tcMar>
-          </w:tcPr>
-          <w:p>
-            <w:r>
-              <w:rPr>
-                <w:sz w:val="18"/>
-                <w:szCs w:val="18"/>
-              </w:rPr>
-              <w:t xml:space="preserve">model_type</w:t>
-            </w:r>
-          </w:p>
-        </w:tc>
-        <w:tc>
-          <w:tcPr>
-            <w:tcW w:type="dxa" w:w="2376"/>
-            <w:tcMar>
-              <w:top w:type="dxa" w:w="60"/>
-              <w:left w:type="dxa" w:w="90"/>
-              <w:bottom w:type="dxa" w:w="60"/>
-              <w:right w:type="dxa" w:w="90"/>
-            </w:tcMar>
-          </w:tcPr>
-          <w:p>
-            <w:r>
-              <w:rPr>
-                <w:sz w:val="18"/>
-                <w:szCs w:val="18"/>
-              </w:rPr>
-              <w:t xml:space="preserve">필수</w:t>
-            </w:r>
-          </w:p>
-        </w:tc>
-        <w:tc>
-          <w:tcPr>
-            <w:tcW w:type="dxa" w:w="2376"/>
-            <w:tcMar>
-              <w:top w:type="dxa" w:w="60"/>
-              <w:left w:type="dxa" w:w="90"/>
-              <w:bottom w:type="dxa" w:w="60"/>
-              <w:right w:type="dxa" w:w="90"/>
-            </w:tcMar>
-          </w:tcPr>
-          <w:p>
-            <w:r>
-              <w:rPr>
-                <w:sz w:val="18"/>
-                <w:szCs w:val="18"/>
-              </w:rPr>
-              <w:t xml:space="preserve">RP 또는 HILIC(행마다, 섞어도 됨). 이 열로 행마다 쓸 모델을 정함</w:t>
-            </w:r>
-          </w:p>
-        </w:tc>
-        <w:tc>
-          <w:tcPr>
-            <w:tcW w:type="dxa" w:w="2376"/>
-            <w:tcMar>
-              <w:top w:type="dxa" w:w="60"/>
-              <w:left w:type="dxa" w:w="90"/>
-              <w:bottom w:type="dxa" w:w="60"/>
-              <w:right w:type="dxa" w:w="90"/>
-            </w:tcMar>
-          </w:tcPr>
-          <w:p>
-            <w:r>
-              <w:rPr>
-                <w:sz w:val="18"/>
-                <w:szCs w:val="18"/>
-              </w:rPr>
-              <w:t xml:space="preserve">RP</w:t>
+            <w:tcW w:type="dxa" w:w="1800"/>
+            <w:tcMar>
+              <w:top w:type="dxa" w:w="60"/>
+              <w:left w:type="dxa" w:w="90"/>
+              <w:bottom w:type="dxa" w:w="60"/>
+              <w:right w:type="dxa" w:w="90"/>
+            </w:tcMar>
+          </w:tcPr>
+          <w:p>
+            <w:r>
+              <w:rPr>
+                <w:sz w:val="18"/>
+                <w:szCs w:val="18"/>
+              </w:rPr>
+              <w:t xml:space="preserve">샘플시트 본문</w:t>
+            </w:r>
+          </w:p>
+        </w:tc>
+        <w:tc>
+          <w:tcPr>
+            <w:tcW w:type="dxa" w:w="3853"/>
+            <w:tcMar>
+              <w:top w:type="dxa" w:w="60"/>
+              <w:left w:type="dxa" w:w="90"/>
+              <w:bottom w:type="dxa" w:w="60"/>
+              <w:right w:type="dxa" w:w="90"/>
+            </w:tcMar>
+          </w:tcPr>
+          <w:p>
+            <w:r>
+              <w:rPr>
+                <w:sz w:val="18"/>
+                <w:szCs w:val="18"/>
+              </w:rPr>
+              <w:t xml:space="preserve">한 행에 화합물 하나를 적은 CSV 또는 XLSX 표입니다. 첫 행은 열 이름입니다. SMILES(필수): 분자 구조 문자열(smiles, structure도 가능). model_type(필수): 행마다 RP 또는 HILIC이며, 한 표에 섞어도 됩니다. 이 값으로 행마다 쓸 모델을 정합니다. RT(선택): 측정 머무름 시간(분, experimental_rt, retention_time도 가능)이며, 있으면 측정과 예측의 차이(ΔRT)를 계산합니다. compound_id, Name, InChIKey(선택): 추적용 정보로 결과에 그대로 남습니다.</w:t>
+            </w:r>
+          </w:p>
+        </w:tc>
+        <w:tc>
+          <w:tcPr>
+            <w:tcW w:type="dxa" w:w="3853"/>
+            <w:tcMar>
+              <w:top w:type="dxa" w:w="60"/>
+              <w:left w:type="dxa" w:w="90"/>
+              <w:bottom w:type="dxa" w:w="60"/>
+              <w:right w:type="dxa" w:w="90"/>
+            </w:tcMar>
+          </w:tcPr>
+          <w:p>
+            <w:r>
+              <w:rPr>
+                <w:sz w:val="18"/>
+                <w:szCs w:val="18"/>
+              </w:rPr>
+              <w:t xml:space="preserve">A CSV or XLSX table with one compound per row and column names in the first row. SMILES (required): structure string (smiles or structure also accepted). model_type (required): RP or HILIC per row; both may be mixed in one table, and the value selects the model for each row. RT (optional): measured retention time in minutes (experimental_rt or retention_time also accepted); when given, the difference between measured and predicted RT (ΔRT) is computed. compound_id, Name, InChIKey (optional): identifiers kept unchanged in the results.</w:t>
             </w:r>
           </w:p>
         </w:tc>
@@ -3609,197 +3516,67 @@
       <w:tr>
         <w:tc>
           <w:tcPr>
-            <w:tcW w:type="dxa" w:w="2376"/>
-            <w:tcMar>
-              <w:top w:type="dxa" w:w="60"/>
-              <w:left w:type="dxa" w:w="90"/>
-              <w:bottom w:type="dxa" w:w="60"/>
-              <w:right w:type="dxa" w:w="90"/>
-            </w:tcMar>
-          </w:tcPr>
-          <w:p>
-            <w:r>
-              <w:rPr>
-                <w:sz w:val="18"/>
-                <w:szCs w:val="18"/>
-              </w:rPr>
-              <w:t xml:space="preserve">RT</w:t>
-            </w:r>
-          </w:p>
-        </w:tc>
-        <w:tc>
-          <w:tcPr>
-            <w:tcW w:type="dxa" w:w="2376"/>
-            <w:tcMar>
-              <w:top w:type="dxa" w:w="60"/>
-              <w:left w:type="dxa" w:w="90"/>
-              <w:bottom w:type="dxa" w:w="60"/>
-              <w:right w:type="dxa" w:w="90"/>
-            </w:tcMar>
-          </w:tcPr>
-          <w:p>
-            <w:r>
-              <w:rPr>
-                <w:sz w:val="18"/>
-                <w:szCs w:val="18"/>
-              </w:rPr>
-              <w:t xml:space="preserve">선택</w:t>
-            </w:r>
-          </w:p>
-        </w:tc>
-        <w:tc>
-          <w:tcPr>
-            <w:tcW w:type="dxa" w:w="2376"/>
-            <w:tcMar>
-              <w:top w:type="dxa" w:w="60"/>
-              <w:left w:type="dxa" w:w="90"/>
-              <w:bottom w:type="dxa" w:w="60"/>
-              <w:right w:type="dxa" w:w="90"/>
-            </w:tcMar>
-          </w:tcPr>
-          <w:p>
-            <w:r>
-              <w:rPr>
-                <w:sz w:val="18"/>
-                <w:szCs w:val="18"/>
-              </w:rPr>
-              <w:t xml:space="preserve">측정 RT(</w:t>
-            </w:r>
-            <w:r>
-              <w:rPr>
-                <w:sz w:val="18"/>
-                <w:szCs w:val="18"/>
-              </w:rPr>
-              <w:t xml:space="preserve">experimental_rt</w:t>
-            </w:r>
-            <w:r>
-              <w:rPr>
-                <w:sz w:val="18"/>
-                <w:szCs w:val="18"/>
-              </w:rPr>
-              <w:t xml:space="preserve">, </w:t>
-            </w:r>
-            <w:r>
-              <w:rPr>
-                <w:sz w:val="18"/>
-                <w:szCs w:val="18"/>
-              </w:rPr>
-              <w:t xml:space="preserve">retention_time</w:t>
-            </w:r>
-            <w:r>
-              <w:rPr>
-                <w:sz w:val="18"/>
-                <w:szCs w:val="18"/>
-              </w:rPr>
-              <w:t xml:space="preserve">도 가능). 있으면 ΔRT 계산</w:t>
-            </w:r>
-          </w:p>
-        </w:tc>
-        <w:tc>
-          <w:tcPr>
-            <w:tcW w:type="dxa" w:w="2376"/>
-            <w:tcMar>
-              <w:top w:type="dxa" w:w="60"/>
-              <w:left w:type="dxa" w:w="90"/>
-              <w:bottom w:type="dxa" w:w="60"/>
-              <w:right w:type="dxa" w:w="90"/>
-            </w:tcMar>
-          </w:tcPr>
-          <w:p>
-            <w:r>
-              <w:rPr>
-                <w:sz w:val="18"/>
-                <w:szCs w:val="18"/>
-              </w:rPr>
-              <w:t xml:space="preserve">5.4</w:t>
-            </w:r>
-          </w:p>
-        </w:tc>
-      </w:tr>
-      <w:tr>
-        <w:tc>
-          <w:tcPr>
-            <w:tcW w:type="dxa" w:w="2376"/>
-            <w:tcMar>
-              <w:top w:type="dxa" w:w="60"/>
-              <w:left w:type="dxa" w:w="90"/>
-              <w:bottom w:type="dxa" w:w="60"/>
-              <w:right w:type="dxa" w:w="90"/>
-            </w:tcMar>
-          </w:tcPr>
-          <w:p>
-            <w:r>
-              <w:rPr>
-                <w:sz w:val="18"/>
-                <w:szCs w:val="18"/>
-              </w:rPr>
-              <w:t xml:space="preserve">compound_id, Name, InChIKey</w:t>
-            </w:r>
-          </w:p>
-        </w:tc>
-        <w:tc>
-          <w:tcPr>
-            <w:tcW w:type="dxa" w:w="2376"/>
-            <w:tcMar>
-              <w:top w:type="dxa" w:w="60"/>
-              <w:left w:type="dxa" w:w="90"/>
-              <w:bottom w:type="dxa" w:w="60"/>
-              <w:right w:type="dxa" w:w="90"/>
-            </w:tcMar>
-          </w:tcPr>
-          <w:p>
-            <w:r>
-              <w:rPr>
-                <w:sz w:val="18"/>
-                <w:szCs w:val="18"/>
-              </w:rPr>
-              <w:t xml:space="preserve">선택</w:t>
-            </w:r>
-          </w:p>
-        </w:tc>
-        <w:tc>
-          <w:tcPr>
-            <w:tcW w:type="dxa" w:w="2376"/>
-            <w:tcMar>
-              <w:top w:type="dxa" w:w="60"/>
-              <w:left w:type="dxa" w:w="90"/>
-              <w:bottom w:type="dxa" w:w="60"/>
-              <w:right w:type="dxa" w:w="90"/>
-            </w:tcMar>
-          </w:tcPr>
-          <w:p>
-            <w:r>
-              <w:rPr>
-                <w:sz w:val="18"/>
-                <w:szCs w:val="18"/>
-              </w:rPr>
-              <w:t xml:space="preserve">추적용 정보. 그대로 결과에 남음</w:t>
-            </w:r>
-          </w:p>
-        </w:tc>
-        <w:tc>
-          <w:tcPr>
-            <w:tcW w:type="dxa" w:w="2376"/>
-            <w:tcMar>
-              <w:top w:type="dxa" w:w="60"/>
-              <w:left w:type="dxa" w:w="90"/>
-              <w:bottom w:type="dxa" w:w="60"/>
-              <w:right w:type="dxa" w:w="90"/>
-            </w:tcMar>
-          </w:tcPr>
-          <w:p>
-            <w:r>
-              <w:rPr>
-                <w:sz w:val="18"/>
-                <w:szCs w:val="18"/>
-              </w:rPr>
-              <w:t xml:space="preserve">C001</w:t>
-            </w:r>
-          </w:p>
+            <w:tcW w:type="dxa" w:w="1800"/>
+            <w:tcMar>
+              <w:top w:type="dxa" w:w="60"/>
+              <w:left w:type="dxa" w:w="90"/>
+              <w:bottom w:type="dxa" w:w="60"/>
+              <w:right w:type="dxa" w:w="90"/>
+            </w:tcMar>
+          </w:tcPr>
+          <w:p>
+            <w:r>
+              <w:rPr>
+                <w:sz w:val="18"/>
+                <w:szCs w:val="18"/>
+              </w:rPr>
+              <w:t xml:space="preserve">샘플시트 예시 제목</w:t>
+            </w:r>
+          </w:p>
+        </w:tc>
+        <w:tc>
+          <w:tcPr>
+            <w:tcW w:type="dxa" w:w="3853"/>
+            <w:tcMar>
+              <w:top w:type="dxa" w:w="60"/>
+              <w:left w:type="dxa" w:w="90"/>
+              <w:bottom w:type="dxa" w:w="60"/>
+              <w:right w:type="dxa" w:w="90"/>
+            </w:tcMar>
+          </w:tcPr>
+          <w:p>
+            <w:r>
+              <w:rPr>
+                <w:sz w:val="18"/>
+                <w:szCs w:val="18"/>
+              </w:rPr>
+              <w:t xml:space="preserve">compounds.csv</w:t>
+            </w:r>
+          </w:p>
+        </w:tc>
+        <w:tc>
+          <w:tcPr>
+            <w:tcW w:type="dxa" w:w="3853"/>
+            <w:tcMar>
+              <w:top w:type="dxa" w:w="60"/>
+              <w:left w:type="dxa" w:w="90"/>
+              <w:bottom w:type="dxa" w:w="60"/>
+              <w:right w:type="dxa" w:w="90"/>
+            </w:tcMar>
+          </w:tcPr>
+          <w:p/>
         </w:tc>
       </w:tr>
     </w:tbl>
     <w:p/>
+    <w:p>
+      <w:pPr>
+        <w:spacing w:after="140"/>
+      </w:pPr>
+      <w:r>
+        <w:t xml:space="preserve">샘플시트 예시 본문:</w:t>
+      </w:r>
+    </w:p>
     <w:p>
       <w:pPr>
         <w:shd w:fill="F3F4F6" w:color="auto" w:val="clear"/>
@@ -3941,7 +3718,7 @@
                 <w:sz w:val="18"/>
                 <w:szCs w:val="18"/>
               </w:rPr>
-              <w:t xml:space="preserve">기본 모델은 서울대가 학습해 제공한 RP·HILIC 모델이며 RT 단위는 분(min)입니다. 기본 모델의 학습 LC 조건(컬럼, 이동상, gradient)은 제공 자료에서 확인되지 않아, 실측 RT와 비교할 때는 같은 조건인지 주의해 주세요.</w:t>
+              <w:t xml:space="preserve">예측 모델은 model_dir로 정합니다. 비워 두면(default) 이미지에 들어 있는 사전 학습 RP·HILIC 모델로 예측하고, rtpred_train 결과 폴더를 주면 그 사용자 모델로 예측합니다.</w:t>
             </w:r>
           </w:p>
         </w:tc>
@@ -3961,7 +3738,7 @@
                 <w:sz w:val="18"/>
                 <w:szCs w:val="18"/>
               </w:rPr>
-              <w:t xml:space="preserve">The default RP and HILIC models were trained and provided by SNU, with RT in minutes. Their LC conditions (column, mobile phase, gradient) are not stated in the provided material, so take care when comparing with your measured RT.</w:t>
+              <w:t xml:space="preserve">The prediction model is chosen with model_dir: empty (default) uses the pre-trained RP and HILIC models in the image, and a rtpred_train output folder uses that user model.</w:t>
             </w:r>
           </w:p>
         </w:tc>
@@ -3983,7 +3760,7 @@
                 <w:sz w:val="18"/>
                 <w:szCs w:val="18"/>
               </w:rPr>
-              <w:t xml:space="preserve">학습 모델로 예측하면 행마다 그 모드의 학습 모델을 씁니다. 학습하지 않은 모드의 행(예: RP만 학습했을 때 HILIC 행)은 결과 표에 남되 predicted_rt가 비고 parse_status=no_trained_model로 표시되며, 로그에 그 행 수가 경고로 남습니다. 그 행까지 예측하려면 그 모드도 학습하거나 기본 모델(model_dir 비움)로 따로 실행해 주세요. 표의 어떤 행도 학습한 모드가 아니면 멈춥니다.</w:t>
+              <w:t xml:space="preserve">사전 학습 모델의 RT 단위는 분(min)입니다. 학습 LC 조건(컬럼, 이동상, gradient)은 공개되지 않았으므로, 실측 RT와 비교할 때는 조건 차이를 감안해 주세요. 내 LC 조건에 맞는 예측이 필요하면 rtpred_train으로 사용자 모델을 만들어 주세요.</w:t>
             </w:r>
           </w:p>
         </w:tc>
@@ -4003,7 +3780,7 @@
                 <w:sz w:val="18"/>
                 <w:szCs w:val="18"/>
               </w:rPr>
-              <w:t xml:space="preserve">With trained models each row uses the trained model of its mode. Rows of a mode that was not trained (for example HILIC rows when only RP was trained) stay in the table with an empty predicted_rt and parse_status=no_trained_model, and the log warns with their number. To predict them, train that mode too or run separately with the default models (empty model_dir). The run stops when no row has a trained mode.</w:t>
+              <w:t xml:space="preserve">The pre-trained models give RT in minutes. Their LC conditions (column, mobile phase, gradient) are not published, so allow for condition differences when comparing with measured RT; for predictions matching your LC conditions, build a user model with rtpred_train.</w:t>
             </w:r>
           </w:p>
         </w:tc>
@@ -4025,7 +3802,7 @@
                 <w:sz w:val="18"/>
                 <w:szCs w:val="18"/>
               </w:rPr>
-              <w:t xml:space="preserve">잘못되었거나 빈 SMILES 행은 지우지 않고 parse_status=invalid_smiles와 사유를 남기며 예측값은 비웁니다. 오류가 아니라 입력 데이터의 결과입니다.</w:t>
+              <w:t xml:space="preserve">학습 모델로 예측하면 행마다 그 모드의 학습 모델을 씁니다. 학습하지 않은 모드의 행(예: RP만 학습했을 때 HILIC 행)은 결과 표에 남되 predicted_rt가 비고 parse_status=no_trained_model로 표시되며, 로그에 그 행 수가 경고로 남습니다. 그 행까지 예측하려면 그 모드도 학습하거나 기본 모델(model_dir 비움)로 따로 실행해 주세요. 표의 어떤 행도 학습한 모드가 아니면 멈춥니다.</w:t>
             </w:r>
           </w:p>
         </w:tc>
@@ -4045,7 +3822,7 @@
                 <w:sz w:val="18"/>
                 <w:szCs w:val="18"/>
               </w:rPr>
-              <w:t xml:space="preserve">Invalid or empty SMILES rows are kept with parse_status=invalid_smiles and the reason, with an empty prediction; this reflects the input, not an error.</w:t>
+              <w:t xml:space="preserve">With trained models each row uses the trained model of its mode. Rows of a mode that was not trained (for example HILIC rows when only RP was trained) stay in the table with an empty predicted_rt and parse_status=no_trained_model, and the log warns with their number. To predict them, train that mode too or run separately with the default models (empty model_dir). The run stops when no row has a trained mode.</w:t>
             </w:r>
           </w:p>
         </w:tc>
@@ -4067,7 +3844,7 @@
                 <w:sz w:val="18"/>
                 <w:szCs w:val="18"/>
               </w:rPr>
-              <w:t xml:space="preserve">모델이 낸 RT를 보정하거나 단위를 바꾸지 않습니다. 학습 모델로 예측하면 rt_unit 열에 학습 때의 단위가 적힙니다.</w:t>
+              <w:t xml:space="preserve">잘못되었거나 빈 SMILES 행은 지우지 않고 parse_status=invalid_smiles와 사유를 남기며 예측값은 비웁니다. 오류가 아니라 입력 데이터의 결과입니다.</w:t>
             </w:r>
           </w:p>
         </w:tc>
@@ -4087,7 +3864,7 @@
                 <w:sz w:val="18"/>
                 <w:szCs w:val="18"/>
               </w:rPr>
-              <w:t xml:space="preserve">The RT returned by the model is neither corrected nor converted; with trained models the rt_unit column gives the unit used in training.</w:t>
+              <w:t xml:space="preserve">Invalid or empty SMILES rows are kept with parse_status=invalid_smiles and the reason, with an empty prediction; this reflects the input, not an error.</w:t>
             </w:r>
           </w:p>
         </w:tc>
@@ -4109,7 +3886,7 @@
                 <w:sz w:val="18"/>
                 <w:szCs w:val="18"/>
               </w:rPr>
-              <w:t xml:space="preserve">학습 모델은 같은 버전의 이미지(bx_rtpred_train 1.0)로 학습한 것만 쓸 수 있습니다. 패키지 버전이 다르면 서울대 코드가 멈춥니다.</w:t>
+              <w:t xml:space="preserve">모델이 낸 RT를 보정하거나 단위를 바꾸지 않습니다. 학습 모델로 예측하면 rt_unit 열에 학습 때의 단위가 적힙니다.</w:t>
             </w:r>
           </w:p>
         </w:tc>
@@ -4129,7 +3906,49 @@
                 <w:sz w:val="18"/>
                 <w:szCs w:val="18"/>
               </w:rPr>
-              <w:t xml:space="preserve">Only models trained with the matching image (bx_rtpred_train 1.0) can be used; the SNU code stops on different package versions.</w:t>
+              <w:t xml:space="preserve">The RT returned by the model is neither corrected nor converted; with trained models the rt_unit column gives the unit used in training.</w:t>
+            </w:r>
+          </w:p>
+        </w:tc>
+      </w:tr>
+      <w:tr>
+        <w:tc>
+          <w:tcPr>
+            <w:tcW w:type="dxa" w:w="4753"/>
+            <w:tcMar>
+              <w:top w:type="dxa" w:w="60"/>
+              <w:left w:type="dxa" w:w="90"/>
+              <w:bottom w:type="dxa" w:w="60"/>
+              <w:right w:type="dxa" w:w="90"/>
+            </w:tcMar>
+          </w:tcPr>
+          <w:p>
+            <w:r>
+              <w:rPr>
+                <w:sz w:val="18"/>
+                <w:szCs w:val="18"/>
+              </w:rPr>
+              <w:t xml:space="preserve">학습 모델은 같은 버전의 이미지(bx_rtpred_train 1.0)로 학습한 것만 쓸 수 있습니다. 패키지 버전이 다르면 RTpred가 멈춥니다.</w:t>
+            </w:r>
+          </w:p>
+        </w:tc>
+        <w:tc>
+          <w:tcPr>
+            <w:tcW w:type="dxa" w:w="4753"/>
+            <w:tcMar>
+              <w:top w:type="dxa" w:w="60"/>
+              <w:left w:type="dxa" w:w="90"/>
+              <w:bottom w:type="dxa" w:w="60"/>
+              <w:right w:type="dxa" w:w="90"/>
+            </w:tcMar>
+          </w:tcPr>
+          <w:p>
+            <w:r>
+              <w:rPr>
+                <w:sz w:val="18"/>
+                <w:szCs w:val="18"/>
+              </w:rPr>
+              <w:t xml:space="preserve">Only models trained with the matching image (bx_rtpred_train 1.0) can be used; RTpred stops on different package versions.</w:t>
             </w:r>
           </w:p>
         </w:tc>
@@ -4908,27 +4727,27 @@
                 <w:sz w:val="18"/>
                 <w:szCs w:val="18"/>
               </w:rPr>
-              <w:t xml:space="preserve">Omics</w:t>
-            </w:r>
-          </w:p>
-        </w:tc>
-        <w:tc>
-          <w:tcPr>
-            <w:tcW w:type="dxa" w:w="3853"/>
-            <w:tcMar>
-              <w:top w:type="dxa" w:w="60"/>
-              <w:left w:type="dxa" w:w="90"/>
-              <w:bottom w:type="dxa" w:w="60"/>
-              <w:right w:type="dxa" w:w="90"/>
-            </w:tcMar>
-          </w:tcPr>
-          <w:p>
-            <w:r>
-              <w:rPr>
-                <w:sz w:val="18"/>
-                <w:szCs w:val="18"/>
-              </w:rPr>
-              <w:t xml:space="preserve">Omics</w:t>
+              <w:t xml:space="preserve">Annotation</w:t>
+            </w:r>
+          </w:p>
+        </w:tc>
+        <w:tc>
+          <w:tcPr>
+            <w:tcW w:type="dxa" w:w="3853"/>
+            <w:tcMar>
+              <w:top w:type="dxa" w:w="60"/>
+              <w:left w:type="dxa" w:w="90"/>
+              <w:bottom w:type="dxa" w:w="60"/>
+              <w:right w:type="dxa" w:w="90"/>
+            </w:tcMar>
+          </w:tcPr>
+          <w:p>
+            <w:r>
+              <w:rPr>
+                <w:sz w:val="18"/>
+                <w:szCs w:val="18"/>
+              </w:rPr>
+              <w:t xml:space="preserve">Annotation</w:t>
             </w:r>
           </w:p>
         </w:tc>
@@ -4970,27 +4789,27 @@
                 <w:sz w:val="18"/>
                 <w:szCs w:val="18"/>
               </w:rPr>
-              <w:t xml:space="preserve">Metabolite_Identification (신규)</w:t>
-            </w:r>
-          </w:p>
-        </w:tc>
-        <w:tc>
-          <w:tcPr>
-            <w:tcW w:type="dxa" w:w="3853"/>
-            <w:tcMar>
-              <w:top w:type="dxa" w:w="60"/>
-              <w:left w:type="dxa" w:w="90"/>
-              <w:bottom w:type="dxa" w:w="60"/>
-              <w:right w:type="dxa" w:w="90"/>
-            </w:tcMar>
-          </w:tcPr>
-          <w:p>
-            <w:r>
-              <w:rPr>
-                <w:sz w:val="18"/>
-                <w:szCs w:val="18"/>
-              </w:rPr>
-              <w:t xml:space="preserve">Metabolite_Identification (new)</w:t>
+              <w:t xml:space="preserve">Metabolite_Annotation (신규)</w:t>
+            </w:r>
+          </w:p>
+        </w:tc>
+        <w:tc>
+          <w:tcPr>
+            <w:tcW w:type="dxa" w:w="3853"/>
+            <w:tcMar>
+              <w:top w:type="dxa" w:w="60"/>
+              <w:left w:type="dxa" w:w="90"/>
+              <w:bottom w:type="dxa" w:w="60"/>
+              <w:right w:type="dxa" w:w="90"/>
+            </w:tcMar>
+          </w:tcPr>
+          <w:p>
+            <w:r>
+              <w:rPr>
+                <w:sz w:val="18"/>
+                <w:szCs w:val="18"/>
+              </w:rPr>
+              <w:t xml:space="preserve">Metabolite_Annotation (new)</w:t>
             </w:r>
           </w:p>
         </w:tc>
@@ -5032,7 +4851,7 @@
                 <w:sz w:val="18"/>
                 <w:szCs w:val="18"/>
               </w:rPr>
-              <w:t xml:space="preserve">retention time, model training, AutoGluon, pyRetip, RDKit, RP, HILIC, machine learning</w:t>
+              <w:t xml:space="preserve">retention time, model training, metabolomics, metabolite annotation, AutoGluon, pyRetip, RDKit, RP, HILIC, machine learning, cheminformatics</w:t>
             </w:r>
           </w:p>
         </w:tc>
@@ -8589,7 +8408,7 @@
     </w:p>
     <w:tbl>
       <w:tblPr>
-        <w:tblW w:type="dxa" w:w="9504"/>
+        <w:tblW w:type="dxa" w:w="9506"/>
         <w:tblBorders>
           <w:top w:val="single" w:color="auto" w:sz="4"/>
           <w:left w:val="single" w:color="auto" w:sz="4"/>
@@ -8600,15 +8419,14 @@
         </w:tblBorders>
       </w:tblPr>
       <w:tblGrid>
-        <w:gridCol w:w="2376"/>
-        <w:gridCol w:w="2376"/>
-        <w:gridCol w:w="2376"/>
-        <w:gridCol w:w="2376"/>
+        <w:gridCol w:w="1800"/>
+        <w:gridCol w:w="3853"/>
+        <w:gridCol w:w="3853"/>
       </w:tblGrid>
       <w:tr>
         <w:tc>
           <w:tcPr>
-            <w:tcW w:type="dxa" w:w="2376"/>
+            <w:tcW w:type="dxa" w:w="1800"/>
             <w:shd w:fill="E8EDF6" w:color="auto" w:val="clear"/>
             <w:tcMar>
               <w:top w:type="dxa" w:w="60"/>
@@ -8626,13 +8444,13 @@
                 <w:sz w:val="18"/>
                 <w:szCs w:val="18"/>
               </w:rPr>
-              <w:t xml:space="preserve">열</w:t>
-            </w:r>
-          </w:p>
-        </w:tc>
-        <w:tc>
-          <w:tcPr>
-            <w:tcW w:type="dxa" w:w="2376"/>
+              <w:t xml:space="preserve">칸</w:t>
+            </w:r>
+          </w:p>
+        </w:tc>
+        <w:tc>
+          <w:tcPr>
+            <w:tcW w:type="dxa" w:w="3853"/>
             <w:shd w:fill="E8EDF6" w:color="auto" w:val="clear"/>
             <w:tcMar>
               <w:top w:type="dxa" w:w="60"/>
@@ -8650,13 +8468,13 @@
                 <w:sz w:val="18"/>
                 <w:szCs w:val="18"/>
               </w:rPr>
-              <w:t xml:space="preserve">필수</w:t>
-            </w:r>
-          </w:p>
-        </w:tc>
-        <w:tc>
-          <w:tcPr>
-            <w:tcW w:type="dxa" w:w="2376"/>
+              <w:t xml:space="preserve">국문</w:t>
+            </w:r>
+          </w:p>
+        </w:tc>
+        <w:tc>
+          <w:tcPr>
+            <w:tcW w:type="dxa" w:w="3853"/>
             <w:shd w:fill="E8EDF6" w:color="auto" w:val="clear"/>
             <w:tcMar>
               <w:top w:type="dxa" w:w="60"/>
@@ -8674,31 +8492,7 @@
                 <w:sz w:val="18"/>
                 <w:szCs w:val="18"/>
               </w:rPr>
-              <w:t xml:space="preserve">설명</w:t>
-            </w:r>
-          </w:p>
-        </w:tc>
-        <w:tc>
-          <w:tcPr>
-            <w:tcW w:type="dxa" w:w="2376"/>
-            <w:shd w:fill="E8EDF6" w:color="auto" w:val="clear"/>
-            <w:tcMar>
-              <w:top w:type="dxa" w:w="60"/>
-              <w:left w:type="dxa" w:w="90"/>
-              <w:bottom w:type="dxa" w:w="60"/>
-              <w:right w:type="dxa" w:w="90"/>
-            </w:tcMar>
-          </w:tcPr>
-          <w:p>
-            <w:r>
-              <w:rPr>
-                <w:b/>
-                <w:bCs/>
-                <w:color w:val="32549C"/>
-                <w:sz w:val="18"/>
-                <w:szCs w:val="18"/>
-              </w:rPr>
-              <w:t xml:space="preserve">예시</w:t>
+              <w:t xml:space="preserve">영문</w:t>
             </w:r>
           </w:p>
         </w:tc>
@@ -8706,81 +8500,61 @@
       <w:tr>
         <w:tc>
           <w:tcPr>
-            <w:tcW w:type="dxa" w:w="2376"/>
-            <w:tcMar>
-              <w:top w:type="dxa" w:w="60"/>
-              <w:left w:type="dxa" w:w="90"/>
-              <w:bottom w:type="dxa" w:w="60"/>
-              <w:right w:type="dxa" w:w="90"/>
-            </w:tcMar>
-          </w:tcPr>
-          <w:p>
-            <w:r>
-              <w:rPr>
-                <w:sz w:val="18"/>
-                <w:szCs w:val="18"/>
-              </w:rPr>
-              <w:t xml:space="preserve">SMILES</w:t>
-            </w:r>
-          </w:p>
-        </w:tc>
-        <w:tc>
-          <w:tcPr>
-            <w:tcW w:type="dxa" w:w="2376"/>
-            <w:tcMar>
-              <w:top w:type="dxa" w:w="60"/>
-              <w:left w:type="dxa" w:w="90"/>
-              <w:bottom w:type="dxa" w:w="60"/>
-              <w:right w:type="dxa" w:w="90"/>
-            </w:tcMar>
-          </w:tcPr>
-          <w:p>
-            <w:r>
-              <w:rPr>
-                <w:sz w:val="18"/>
-                <w:szCs w:val="18"/>
-              </w:rPr>
-              <w:t xml:space="preserve">필수</w:t>
-            </w:r>
-          </w:p>
-        </w:tc>
-        <w:tc>
-          <w:tcPr>
-            <w:tcW w:type="dxa" w:w="2376"/>
-            <w:tcMar>
-              <w:top w:type="dxa" w:w="60"/>
-              <w:left w:type="dxa" w:w="90"/>
-              <w:bottom w:type="dxa" w:w="60"/>
-              <w:right w:type="dxa" w:w="90"/>
-            </w:tcMar>
-          </w:tcPr>
-          <w:p>
-            <w:r>
-              <w:rPr>
-                <w:sz w:val="18"/>
-                <w:szCs w:val="18"/>
-              </w:rPr>
-              <w:t xml:space="preserve">분자 구조 문자열</w:t>
-            </w:r>
-          </w:p>
-        </w:tc>
-        <w:tc>
-          <w:tcPr>
-            <w:tcW w:type="dxa" w:w="2376"/>
-            <w:tcMar>
-              <w:top w:type="dxa" w:w="60"/>
-              <w:left w:type="dxa" w:w="90"/>
-              <w:bottom w:type="dxa" w:w="60"/>
-              <w:right w:type="dxa" w:w="90"/>
-            </w:tcMar>
-          </w:tcPr>
-          <w:p>
-            <w:r>
-              <w:rPr>
-                <w:sz w:val="18"/>
-                <w:szCs w:val="18"/>
-              </w:rPr>
-              <w:t xml:space="preserve">CCO</w:t>
+            <w:tcW w:type="dxa" w:w="1800"/>
+            <w:tcMar>
+              <w:top w:type="dxa" w:w="60"/>
+              <w:left w:type="dxa" w:w="90"/>
+              <w:bottom w:type="dxa" w:w="60"/>
+              <w:right w:type="dxa" w:w="90"/>
+            </w:tcMar>
+          </w:tcPr>
+          <w:p>
+            <w:r>
+              <w:rPr>
+                <w:sz w:val="18"/>
+                <w:szCs w:val="18"/>
+              </w:rPr>
+              <w:t xml:space="preserve">샘플시트 제목</w:t>
+            </w:r>
+          </w:p>
+        </w:tc>
+        <w:tc>
+          <w:tcPr>
+            <w:tcW w:type="dxa" w:w="3853"/>
+            <w:tcMar>
+              <w:top w:type="dxa" w:w="60"/>
+              <w:left w:type="dxa" w:w="90"/>
+              <w:bottom w:type="dxa" w:w="60"/>
+              <w:right w:type="dxa" w:w="90"/>
+            </w:tcMar>
+          </w:tcPr>
+          <w:p>
+            <w:r>
+              <w:rPr>
+                <w:sz w:val="18"/>
+                <w:szCs w:val="18"/>
+              </w:rPr>
+              <w:t xml:space="preserve">학습용 측정 RT 표</w:t>
+            </w:r>
+          </w:p>
+        </w:tc>
+        <w:tc>
+          <w:tcPr>
+            <w:tcW w:type="dxa" w:w="3853"/>
+            <w:tcMar>
+              <w:top w:type="dxa" w:w="60"/>
+              <w:left w:type="dxa" w:w="90"/>
+              <w:bottom w:type="dxa" w:w="60"/>
+              <w:right w:type="dxa" w:w="90"/>
+            </w:tcMar>
+          </w:tcPr>
+          <w:p>
+            <w:r>
+              <w:rPr>
+                <w:sz w:val="18"/>
+                <w:szCs w:val="18"/>
+              </w:rPr>
+              <w:t xml:space="preserve">Measured RT table for training</w:t>
             </w:r>
           </w:p>
         </w:tc>
@@ -8788,109 +8562,61 @@
       <w:tr>
         <w:tc>
           <w:tcPr>
-            <w:tcW w:type="dxa" w:w="2376"/>
-            <w:tcMar>
-              <w:top w:type="dxa" w:w="60"/>
-              <w:left w:type="dxa" w:w="90"/>
-              <w:bottom w:type="dxa" w:w="60"/>
-              <w:right w:type="dxa" w:w="90"/>
-            </w:tcMar>
-          </w:tcPr>
-          <w:p>
-            <w:r>
-              <w:rPr>
-                <w:sz w:val="18"/>
-                <w:szCs w:val="18"/>
-              </w:rPr>
-              <w:t xml:space="preserve">RT</w:t>
-            </w:r>
-          </w:p>
-        </w:tc>
-        <w:tc>
-          <w:tcPr>
-            <w:tcW w:type="dxa" w:w="2376"/>
-            <w:tcMar>
-              <w:top w:type="dxa" w:w="60"/>
-              <w:left w:type="dxa" w:w="90"/>
-              <w:bottom w:type="dxa" w:w="60"/>
-              <w:right w:type="dxa" w:w="90"/>
-            </w:tcMar>
-          </w:tcPr>
-          <w:p>
-            <w:r>
-              <w:rPr>
-                <w:sz w:val="18"/>
-                <w:szCs w:val="18"/>
-              </w:rPr>
-              <w:t xml:space="preserve">필수</w:t>
-            </w:r>
-          </w:p>
-        </w:tc>
-        <w:tc>
-          <w:tcPr>
-            <w:tcW w:type="dxa" w:w="2376"/>
-            <w:tcMar>
-              <w:top w:type="dxa" w:w="60"/>
-              <w:left w:type="dxa" w:w="90"/>
-              <w:bottom w:type="dxa" w:w="60"/>
-              <w:right w:type="dxa" w:w="90"/>
-            </w:tcMar>
-          </w:tcPr>
-          <w:p>
-            <w:r>
-              <w:rPr>
-                <w:sz w:val="18"/>
-                <w:szCs w:val="18"/>
-              </w:rPr>
-              <w:t xml:space="preserve">측정 RT(</w:t>
-            </w:r>
-            <w:r>
-              <w:rPr>
-                <w:sz w:val="18"/>
-                <w:szCs w:val="18"/>
-              </w:rPr>
-              <w:t xml:space="preserve">experimental_rt</w:t>
-            </w:r>
-            <w:r>
-              <w:rPr>
-                <w:sz w:val="18"/>
-                <w:szCs w:val="18"/>
-              </w:rPr>
-              <w:t xml:space="preserve">, </w:t>
-            </w:r>
-            <w:r>
-              <w:rPr>
-                <w:sz w:val="18"/>
-                <w:szCs w:val="18"/>
-              </w:rPr>
-              <w:t xml:space="preserve">retention_time</w:t>
-            </w:r>
-            <w:r>
-              <w:rPr>
-                <w:sz w:val="18"/>
-                <w:szCs w:val="18"/>
-              </w:rPr>
-              <w:t xml:space="preserve">도 가능). 0 이상 숫자, 모든 행에 필요</w:t>
-            </w:r>
-          </w:p>
-        </w:tc>
-        <w:tc>
-          <w:tcPr>
-            <w:tcW w:type="dxa" w:w="2376"/>
-            <w:tcMar>
-              <w:top w:type="dxa" w:w="60"/>
-              <w:left w:type="dxa" w:w="90"/>
-              <w:bottom w:type="dxa" w:w="60"/>
-              <w:right w:type="dxa" w:w="90"/>
-            </w:tcMar>
-          </w:tcPr>
-          <w:p>
-            <w:r>
-              <w:rPr>
-                <w:sz w:val="18"/>
-                <w:szCs w:val="18"/>
-              </w:rPr>
-              <w:t xml:space="preserve">2.10</w:t>
+            <w:tcW w:type="dxa" w:w="1800"/>
+            <w:tcMar>
+              <w:top w:type="dxa" w:w="60"/>
+              <w:left w:type="dxa" w:w="90"/>
+              <w:bottom w:type="dxa" w:w="60"/>
+              <w:right w:type="dxa" w:w="90"/>
+            </w:tcMar>
+          </w:tcPr>
+          <w:p>
+            <w:r>
+              <w:rPr>
+                <w:sz w:val="18"/>
+                <w:szCs w:val="18"/>
+              </w:rPr>
+              <w:t xml:space="preserve">샘플시트 본문</w:t>
+            </w:r>
+          </w:p>
+        </w:tc>
+        <w:tc>
+          <w:tcPr>
+            <w:tcW w:type="dxa" w:w="3853"/>
+            <w:tcMar>
+              <w:top w:type="dxa" w:w="60"/>
+              <w:left w:type="dxa" w:w="90"/>
+              <w:bottom w:type="dxa" w:w="60"/>
+              <w:right w:type="dxa" w:w="90"/>
+            </w:tcMar>
+          </w:tcPr>
+          <w:p>
+            <w:r>
+              <w:rPr>
+                <w:sz w:val="18"/>
+                <w:szCs w:val="18"/>
+              </w:rPr>
+              <w:t xml:space="preserve">한 행에 화합물 하나와 측정 머무름 시간을 적은 CSV 또는 XLSX 표입니다. 첫 행은 열 이름입니다. SMILES(필수): 분자 구조 문자열. RT(필수): 측정 머무름 시간(experimental_rt, retention_time도 가능). 모든 행에 0 이상 숫자가 있어야 하며 단위는 rt_unit(기본 분)과 같아야 합니다. model_type(필수): 행마다 RP 또는 HILIC이며, 한 표에 섞으면 모드마다 따로 학습합니다. 모드마다 정제 후 25행, 서로 다른 구조 15개 이상이 필요합니다. compound_id, Name(선택): 추적용 정보입니다. 한 모드의 자료는 같은 컬럼, 이동상, gradient로 측정한 것이어야 합니다.</w:t>
+            </w:r>
+          </w:p>
+        </w:tc>
+        <w:tc>
+          <w:tcPr>
+            <w:tcW w:type="dxa" w:w="3853"/>
+            <w:tcMar>
+              <w:top w:type="dxa" w:w="60"/>
+              <w:left w:type="dxa" w:w="90"/>
+              <w:bottom w:type="dxa" w:w="60"/>
+              <w:right w:type="dxa" w:w="90"/>
+            </w:tcMar>
+          </w:tcPr>
+          <w:p>
+            <w:r>
+              <w:rPr>
+                <w:sz w:val="18"/>
+                <w:szCs w:val="18"/>
+              </w:rPr>
+              <w:t xml:space="preserve">A CSV or XLSX table with one compound and its measured retention time per row, column names in the first row. SMILES (required): structure string. RT (required): measured retention time (experimental_rt or retention_time also accepted), a number of 0 or more on every row, in the unit of rt_unit (minutes by default). model_type (required): RP or HILIC per row; when both are present, each mode is trained separately. Each mode needs at least 25 rows and 15 distinct structures after cleaning. compound_id, Name (optional): identifiers. The data of one mode must come from one column, mobile phase and gradient.</w:t>
             </w:r>
           </w:p>
         </w:tc>
@@ -8898,169 +8624,67 @@
       <w:tr>
         <w:tc>
           <w:tcPr>
-            <w:tcW w:type="dxa" w:w="2376"/>
-            <w:tcMar>
-              <w:top w:type="dxa" w:w="60"/>
-              <w:left w:type="dxa" w:w="90"/>
-              <w:bottom w:type="dxa" w:w="60"/>
-              <w:right w:type="dxa" w:w="90"/>
-            </w:tcMar>
-          </w:tcPr>
-          <w:p>
-            <w:r>
-              <w:rPr>
-                <w:sz w:val="18"/>
-                <w:szCs w:val="18"/>
-              </w:rPr>
-              <w:t xml:space="preserve">model_type</w:t>
-            </w:r>
-          </w:p>
-        </w:tc>
-        <w:tc>
-          <w:tcPr>
-            <w:tcW w:type="dxa" w:w="2376"/>
-            <w:tcMar>
-              <w:top w:type="dxa" w:w="60"/>
-              <w:left w:type="dxa" w:w="90"/>
-              <w:bottom w:type="dxa" w:w="60"/>
-              <w:right w:type="dxa" w:w="90"/>
-            </w:tcMar>
-          </w:tcPr>
-          <w:p>
-            <w:r>
-              <w:rPr>
-                <w:sz w:val="18"/>
-                <w:szCs w:val="18"/>
-              </w:rPr>
-              <w:t xml:space="preserve">필수</w:t>
-            </w:r>
-          </w:p>
-        </w:tc>
-        <w:tc>
-          <w:tcPr>
-            <w:tcW w:type="dxa" w:w="2376"/>
-            <w:tcMar>
-              <w:top w:type="dxa" w:w="60"/>
-              <w:left w:type="dxa" w:w="90"/>
-              <w:bottom w:type="dxa" w:w="60"/>
-              <w:right w:type="dxa" w:w="90"/>
-            </w:tcMar>
-          </w:tcPr>
-          <w:p>
-            <w:r>
-              <w:rPr>
-                <w:sz w:val="18"/>
-                <w:szCs w:val="18"/>
-              </w:rPr>
-              <w:t xml:space="preserve">RP 또는 HILIC(행마다, 섞어도 됨). 모드마다 모델을 따로 학습</w:t>
-            </w:r>
-          </w:p>
-        </w:tc>
-        <w:tc>
-          <w:tcPr>
-            <w:tcW w:type="dxa" w:w="2376"/>
-            <w:tcMar>
-              <w:top w:type="dxa" w:w="60"/>
-              <w:left w:type="dxa" w:w="90"/>
-              <w:bottom w:type="dxa" w:w="60"/>
-              <w:right w:type="dxa" w:w="90"/>
-            </w:tcMar>
-          </w:tcPr>
-          <w:p>
-            <w:r>
-              <w:rPr>
-                <w:sz w:val="18"/>
-                <w:szCs w:val="18"/>
-              </w:rPr>
-              <w:t xml:space="preserve">RP</w:t>
-            </w:r>
-          </w:p>
-        </w:tc>
-      </w:tr>
-      <w:tr>
-        <w:tc>
-          <w:tcPr>
-            <w:tcW w:type="dxa" w:w="2376"/>
-            <w:tcMar>
-              <w:top w:type="dxa" w:w="60"/>
-              <w:left w:type="dxa" w:w="90"/>
-              <w:bottom w:type="dxa" w:w="60"/>
-              <w:right w:type="dxa" w:w="90"/>
-            </w:tcMar>
-          </w:tcPr>
-          <w:p>
-            <w:r>
-              <w:rPr>
-                <w:sz w:val="18"/>
-                <w:szCs w:val="18"/>
-              </w:rPr>
-              <w:t xml:space="preserve">compound_id, Name</w:t>
-            </w:r>
-          </w:p>
-        </w:tc>
-        <w:tc>
-          <w:tcPr>
-            <w:tcW w:type="dxa" w:w="2376"/>
-            <w:tcMar>
-              <w:top w:type="dxa" w:w="60"/>
-              <w:left w:type="dxa" w:w="90"/>
-              <w:bottom w:type="dxa" w:w="60"/>
-              <w:right w:type="dxa" w:w="90"/>
-            </w:tcMar>
-          </w:tcPr>
-          <w:p>
-            <w:r>
-              <w:rPr>
-                <w:sz w:val="18"/>
-                <w:szCs w:val="18"/>
-              </w:rPr>
-              <w:t xml:space="preserve">선택</w:t>
-            </w:r>
-          </w:p>
-        </w:tc>
-        <w:tc>
-          <w:tcPr>
-            <w:tcW w:type="dxa" w:w="2376"/>
-            <w:tcMar>
-              <w:top w:type="dxa" w:w="60"/>
-              <w:left w:type="dxa" w:w="90"/>
-              <w:bottom w:type="dxa" w:w="60"/>
-              <w:right w:type="dxa" w:w="90"/>
-            </w:tcMar>
-          </w:tcPr>
-          <w:p>
-            <w:r>
-              <w:rPr>
-                <w:sz w:val="18"/>
-                <w:szCs w:val="18"/>
-              </w:rPr>
-              <w:t xml:space="preserve">추적용 정보</w:t>
-            </w:r>
-          </w:p>
-        </w:tc>
-        <w:tc>
-          <w:tcPr>
-            <w:tcW w:type="dxa" w:w="2376"/>
-            <w:tcMar>
-              <w:top w:type="dxa" w:w="60"/>
-              <w:left w:type="dxa" w:w="90"/>
-              <w:bottom w:type="dxa" w:w="60"/>
-              <w:right w:type="dxa" w:w="90"/>
-            </w:tcMar>
-          </w:tcPr>
-          <w:p>
-            <w:r>
-              <w:rPr>
-                <w:sz w:val="18"/>
-                <w:szCs w:val="18"/>
-              </w:rPr>
-              <w:t xml:space="preserve">S001</w:t>
-            </w:r>
-          </w:p>
+            <w:tcW w:type="dxa" w:w="1800"/>
+            <w:tcMar>
+              <w:top w:type="dxa" w:w="60"/>
+              <w:left w:type="dxa" w:w="90"/>
+              <w:bottom w:type="dxa" w:w="60"/>
+              <w:right w:type="dxa" w:w="90"/>
+            </w:tcMar>
+          </w:tcPr>
+          <w:p>
+            <w:r>
+              <w:rPr>
+                <w:sz w:val="18"/>
+                <w:szCs w:val="18"/>
+              </w:rPr>
+              <w:t xml:space="preserve">샘플시트 예시 제목</w:t>
+            </w:r>
+          </w:p>
+        </w:tc>
+        <w:tc>
+          <w:tcPr>
+            <w:tcW w:type="dxa" w:w="3853"/>
+            <w:tcMar>
+              <w:top w:type="dxa" w:w="60"/>
+              <w:left w:type="dxa" w:w="90"/>
+              <w:bottom w:type="dxa" w:w="60"/>
+              <w:right w:type="dxa" w:w="90"/>
+            </w:tcMar>
+          </w:tcPr>
+          <w:p>
+            <w:r>
+              <w:rPr>
+                <w:sz w:val="18"/>
+                <w:szCs w:val="18"/>
+              </w:rPr>
+              <w:t xml:space="preserve">rt_library.csv</w:t>
+            </w:r>
+          </w:p>
+        </w:tc>
+        <w:tc>
+          <w:tcPr>
+            <w:tcW w:type="dxa" w:w="3853"/>
+            <w:tcMar>
+              <w:top w:type="dxa" w:w="60"/>
+              <w:left w:type="dxa" w:w="90"/>
+              <w:bottom w:type="dxa" w:w="60"/>
+              <w:right w:type="dxa" w:w="90"/>
+            </w:tcMar>
+          </w:tcPr>
+          <w:p/>
         </w:tc>
       </w:tr>
     </w:tbl>
     <w:p/>
+    <w:p>
+      <w:pPr>
+        <w:spacing w:after="140"/>
+      </w:pPr>
+      <w:r>
+        <w:t xml:space="preserve">샘플시트 예시 본문:</w:t>
+      </w:r>
+    </w:p>
     <w:p>
       <w:pPr>
         <w:shd w:fill="F3F4F6" w:color="auto" w:val="clear"/>
@@ -10343,27 +9967,27 @@
                 <w:sz w:val="18"/>
                 <w:szCs w:val="18"/>
               </w:rPr>
-              <w:t xml:space="preserve">Omics</w:t>
-            </w:r>
-          </w:p>
-        </w:tc>
-        <w:tc>
-          <w:tcPr>
-            <w:tcW w:type="dxa" w:w="3853"/>
-            <w:tcMar>
-              <w:top w:type="dxa" w:w="60"/>
-              <w:left w:type="dxa" w:w="90"/>
-              <w:bottom w:type="dxa" w:w="60"/>
-              <w:right w:type="dxa" w:w="90"/>
-            </w:tcMar>
-          </w:tcPr>
-          <w:p>
-            <w:r>
-              <w:rPr>
-                <w:sz w:val="18"/>
-                <w:szCs w:val="18"/>
-              </w:rPr>
-              <w:t xml:space="preserve">Omics</w:t>
+              <w:t xml:space="preserve">Annotation</w:t>
+            </w:r>
+          </w:p>
+        </w:tc>
+        <w:tc>
+          <w:tcPr>
+            <w:tcW w:type="dxa" w:w="3853"/>
+            <w:tcMar>
+              <w:top w:type="dxa" w:w="60"/>
+              <w:left w:type="dxa" w:w="90"/>
+              <w:bottom w:type="dxa" w:w="60"/>
+              <w:right w:type="dxa" w:w="90"/>
+            </w:tcMar>
+          </w:tcPr>
+          <w:p>
+            <w:r>
+              <w:rPr>
+                <w:sz w:val="18"/>
+                <w:szCs w:val="18"/>
+              </w:rPr>
+              <w:t xml:space="preserve">Annotation</w:t>
             </w:r>
           </w:p>
         </w:tc>
@@ -10405,27 +10029,27 @@
                 <w:sz w:val="18"/>
                 <w:szCs w:val="18"/>
               </w:rPr>
-              <w:t xml:space="preserve">Metabolite_Identification (신규)</w:t>
-            </w:r>
-          </w:p>
-        </w:tc>
-        <w:tc>
-          <w:tcPr>
-            <w:tcW w:type="dxa" w:w="3853"/>
-            <w:tcMar>
-              <w:top w:type="dxa" w:w="60"/>
-              <w:left w:type="dxa" w:w="90"/>
-              <w:bottom w:type="dxa" w:w="60"/>
-              <w:right w:type="dxa" w:w="90"/>
-            </w:tcMar>
-          </w:tcPr>
-          <w:p>
-            <w:r>
-              <w:rPr>
-                <w:sz w:val="18"/>
-                <w:szCs w:val="18"/>
-              </w:rPr>
-              <w:t xml:space="preserve">Metabolite_Identification (new)</w:t>
+              <w:t xml:space="preserve">Metabolite_Annotation (신규)</w:t>
+            </w:r>
+          </w:p>
+        </w:tc>
+        <w:tc>
+          <w:tcPr>
+            <w:tcW w:type="dxa" w:w="3853"/>
+            <w:tcMar>
+              <w:top w:type="dxa" w:w="60"/>
+              <w:left w:type="dxa" w:w="90"/>
+              <w:bottom w:type="dxa" w:w="60"/>
+              <w:right w:type="dxa" w:w="90"/>
+            </w:tcMar>
+          </w:tcPr>
+          <w:p>
+            <w:r>
+              <w:rPr>
+                <w:sz w:val="18"/>
+                <w:szCs w:val="18"/>
+              </w:rPr>
+              <w:t xml:space="preserve">Metabolite_Annotation (new)</w:t>
             </w:r>
           </w:p>
         </w:tc>
@@ -10467,7 +10091,7 @@
                 <w:sz w:val="18"/>
                 <w:szCs w:val="18"/>
               </w:rPr>
-              <w:t xml:space="preserve">retention time, model comparison, RMSE, MAE, R-squared, AutoGluon, RP, HILIC</w:t>
+              <w:t xml:space="preserve">retention time, model comparison, metabolomics, metabolite annotation, RMSE, MAE, R-squared, AutoGluon, RP, HILIC, machine learning, cheminformatics</w:t>
             </w:r>
           </w:p>
         </w:tc>
@@ -13386,17 +13010,9 @@
         <w:t xml:space="preserve">샘플시트</w:t>
       </w:r>
     </w:p>
-    <w:p>
-      <w:pPr>
-        <w:spacing w:after="140"/>
-      </w:pPr>
-      <w:r>
-        <w:t xml:space="preserve">평가 표(eval_file)를 따로 줄 때의 형식입니다.</w:t>
-      </w:r>
-    </w:p>
     <w:tbl>
       <w:tblPr>
-        <w:tblW w:type="dxa" w:w="9504"/>
+        <w:tblW w:type="dxa" w:w="9506"/>
         <w:tblBorders>
           <w:top w:val="single" w:color="auto" w:sz="4"/>
           <w:left w:val="single" w:color="auto" w:sz="4"/>
@@ -13407,15 +13023,14 @@
         </w:tblBorders>
       </w:tblPr>
       <w:tblGrid>
-        <w:gridCol w:w="2376"/>
-        <w:gridCol w:w="2376"/>
-        <w:gridCol w:w="2376"/>
-        <w:gridCol w:w="2376"/>
+        <w:gridCol w:w="1800"/>
+        <w:gridCol w:w="3853"/>
+        <w:gridCol w:w="3853"/>
       </w:tblGrid>
       <w:tr>
         <w:tc>
           <w:tcPr>
-            <w:tcW w:type="dxa" w:w="2376"/>
+            <w:tcW w:type="dxa" w:w="1800"/>
             <w:shd w:fill="E8EDF6" w:color="auto" w:val="clear"/>
             <w:tcMar>
               <w:top w:type="dxa" w:w="60"/>
@@ -13433,13 +13048,13 @@
                 <w:sz w:val="18"/>
                 <w:szCs w:val="18"/>
               </w:rPr>
-              <w:t xml:space="preserve">열</w:t>
-            </w:r>
-          </w:p>
-        </w:tc>
-        <w:tc>
-          <w:tcPr>
-            <w:tcW w:type="dxa" w:w="2376"/>
+              <w:t xml:space="preserve">칸</w:t>
+            </w:r>
+          </w:p>
+        </w:tc>
+        <w:tc>
+          <w:tcPr>
+            <w:tcW w:type="dxa" w:w="3853"/>
             <w:shd w:fill="E8EDF6" w:color="auto" w:val="clear"/>
             <w:tcMar>
               <w:top w:type="dxa" w:w="60"/>
@@ -13457,13 +13072,13 @@
                 <w:sz w:val="18"/>
                 <w:szCs w:val="18"/>
               </w:rPr>
-              <w:t xml:space="preserve">필수</w:t>
-            </w:r>
-          </w:p>
-        </w:tc>
-        <w:tc>
-          <w:tcPr>
-            <w:tcW w:type="dxa" w:w="2376"/>
+              <w:t xml:space="preserve">국문</w:t>
+            </w:r>
+          </w:p>
+        </w:tc>
+        <w:tc>
+          <w:tcPr>
+            <w:tcW w:type="dxa" w:w="3853"/>
             <w:shd w:fill="E8EDF6" w:color="auto" w:val="clear"/>
             <w:tcMar>
               <w:top w:type="dxa" w:w="60"/>
@@ -13481,31 +13096,7 @@
                 <w:sz w:val="18"/>
                 <w:szCs w:val="18"/>
               </w:rPr>
-              <w:t xml:space="preserve">설명</w:t>
-            </w:r>
-          </w:p>
-        </w:tc>
-        <w:tc>
-          <w:tcPr>
-            <w:tcW w:type="dxa" w:w="2376"/>
-            <w:shd w:fill="E8EDF6" w:color="auto" w:val="clear"/>
-            <w:tcMar>
-              <w:top w:type="dxa" w:w="60"/>
-              <w:left w:type="dxa" w:w="90"/>
-              <w:bottom w:type="dxa" w:w="60"/>
-              <w:right w:type="dxa" w:w="90"/>
-            </w:tcMar>
-          </w:tcPr>
-          <w:p>
-            <w:r>
-              <w:rPr>
-                <w:b/>
-                <w:bCs/>
-                <w:color w:val="32549C"/>
-                <w:sz w:val="18"/>
-                <w:szCs w:val="18"/>
-              </w:rPr>
-              <w:t xml:space="preserve">예시</w:t>
+              <w:t xml:space="preserve">영문</w:t>
             </w:r>
           </w:p>
         </w:tc>
@@ -13513,81 +13104,61 @@
       <w:tr>
         <w:tc>
           <w:tcPr>
-            <w:tcW w:type="dxa" w:w="2376"/>
-            <w:tcMar>
-              <w:top w:type="dxa" w:w="60"/>
-              <w:left w:type="dxa" w:w="90"/>
-              <w:bottom w:type="dxa" w:w="60"/>
-              <w:right w:type="dxa" w:w="90"/>
-            </w:tcMar>
-          </w:tcPr>
-          <w:p>
-            <w:r>
-              <w:rPr>
-                <w:sz w:val="18"/>
-                <w:szCs w:val="18"/>
-              </w:rPr>
-              <w:t xml:space="preserve">SMILES</w:t>
-            </w:r>
-          </w:p>
-        </w:tc>
-        <w:tc>
-          <w:tcPr>
-            <w:tcW w:type="dxa" w:w="2376"/>
-            <w:tcMar>
-              <w:top w:type="dxa" w:w="60"/>
-              <w:left w:type="dxa" w:w="90"/>
-              <w:bottom w:type="dxa" w:w="60"/>
-              <w:right w:type="dxa" w:w="90"/>
-            </w:tcMar>
-          </w:tcPr>
-          <w:p>
-            <w:r>
-              <w:rPr>
-                <w:sz w:val="18"/>
-                <w:szCs w:val="18"/>
-              </w:rPr>
-              <w:t xml:space="preserve">필수</w:t>
-            </w:r>
-          </w:p>
-        </w:tc>
-        <w:tc>
-          <w:tcPr>
-            <w:tcW w:type="dxa" w:w="2376"/>
-            <w:tcMar>
-              <w:top w:type="dxa" w:w="60"/>
-              <w:left w:type="dxa" w:w="90"/>
-              <w:bottom w:type="dxa" w:w="60"/>
-              <w:right w:type="dxa" w:w="90"/>
-            </w:tcMar>
-          </w:tcPr>
-          <w:p>
-            <w:r>
-              <w:rPr>
-                <w:sz w:val="18"/>
-                <w:szCs w:val="18"/>
-              </w:rPr>
-              <w:t xml:space="preserve">분자 구조 문자열</w:t>
-            </w:r>
-          </w:p>
-        </w:tc>
-        <w:tc>
-          <w:tcPr>
-            <w:tcW w:type="dxa" w:w="2376"/>
-            <w:tcMar>
-              <w:top w:type="dxa" w:w="60"/>
-              <w:left w:type="dxa" w:w="90"/>
-              <w:bottom w:type="dxa" w:w="60"/>
-              <w:right w:type="dxa" w:w="90"/>
-            </w:tcMar>
-          </w:tcPr>
-          <w:p>
-            <w:r>
-              <w:rPr>
-                <w:sz w:val="18"/>
-                <w:szCs w:val="18"/>
-              </w:rPr>
-              <w:t xml:space="preserve">CCO</w:t>
+            <w:tcW w:type="dxa" w:w="1800"/>
+            <w:tcMar>
+              <w:top w:type="dxa" w:w="60"/>
+              <w:left w:type="dxa" w:w="90"/>
+              <w:bottom w:type="dxa" w:w="60"/>
+              <w:right w:type="dxa" w:w="90"/>
+            </w:tcMar>
+          </w:tcPr>
+          <w:p>
+            <w:r>
+              <w:rPr>
+                <w:sz w:val="18"/>
+                <w:szCs w:val="18"/>
+              </w:rPr>
+              <w:t xml:space="preserve">샘플시트 제목</w:t>
+            </w:r>
+          </w:p>
+        </w:tc>
+        <w:tc>
+          <w:tcPr>
+            <w:tcW w:type="dxa" w:w="3853"/>
+            <w:tcMar>
+              <w:top w:type="dxa" w:w="60"/>
+              <w:left w:type="dxa" w:w="90"/>
+              <w:bottom w:type="dxa" w:w="60"/>
+              <w:right w:type="dxa" w:w="90"/>
+            </w:tcMar>
+          </w:tcPr>
+          <w:p>
+            <w:r>
+              <w:rPr>
+                <w:sz w:val="18"/>
+                <w:szCs w:val="18"/>
+              </w:rPr>
+              <w:t xml:space="preserve">평가용 측정 RT 표(선택)</w:t>
+            </w:r>
+          </w:p>
+        </w:tc>
+        <w:tc>
+          <w:tcPr>
+            <w:tcW w:type="dxa" w:w="3853"/>
+            <w:tcMar>
+              <w:top w:type="dxa" w:w="60"/>
+              <w:left w:type="dxa" w:w="90"/>
+              <w:bottom w:type="dxa" w:w="60"/>
+              <w:right w:type="dxa" w:w="90"/>
+            </w:tcMar>
+          </w:tcPr>
+          <w:p>
+            <w:r>
+              <w:rPr>
+                <w:sz w:val="18"/>
+                <w:szCs w:val="18"/>
+              </w:rPr>
+              <w:t xml:space="preserve">Measured RT table for evaluation (optional)</w:t>
             </w:r>
           </w:p>
         </w:tc>
@@ -13595,81 +13166,61 @@
       <w:tr>
         <w:tc>
           <w:tcPr>
-            <w:tcW w:type="dxa" w:w="2376"/>
-            <w:tcMar>
-              <w:top w:type="dxa" w:w="60"/>
-              <w:left w:type="dxa" w:w="90"/>
-              <w:bottom w:type="dxa" w:w="60"/>
-              <w:right w:type="dxa" w:w="90"/>
-            </w:tcMar>
-          </w:tcPr>
-          <w:p>
-            <w:r>
-              <w:rPr>
-                <w:sz w:val="18"/>
-                <w:szCs w:val="18"/>
-              </w:rPr>
-              <w:t xml:space="preserve">RT</w:t>
-            </w:r>
-          </w:p>
-        </w:tc>
-        <w:tc>
-          <w:tcPr>
-            <w:tcW w:type="dxa" w:w="2376"/>
-            <w:tcMar>
-              <w:top w:type="dxa" w:w="60"/>
-              <w:left w:type="dxa" w:w="90"/>
-              <w:bottom w:type="dxa" w:w="60"/>
-              <w:right w:type="dxa" w:w="90"/>
-            </w:tcMar>
-          </w:tcPr>
-          <w:p>
-            <w:r>
-              <w:rPr>
-                <w:sz w:val="18"/>
-                <w:szCs w:val="18"/>
-              </w:rPr>
-              <w:t xml:space="preserve">필수</w:t>
-            </w:r>
-          </w:p>
-        </w:tc>
-        <w:tc>
-          <w:tcPr>
-            <w:tcW w:type="dxa" w:w="2376"/>
-            <w:tcMar>
-              <w:top w:type="dxa" w:w="60"/>
-              <w:left w:type="dxa" w:w="90"/>
-              <w:bottom w:type="dxa" w:w="60"/>
-              <w:right w:type="dxa" w:w="90"/>
-            </w:tcMar>
-          </w:tcPr>
-          <w:p>
-            <w:r>
-              <w:rPr>
-                <w:sz w:val="18"/>
-                <w:szCs w:val="18"/>
-              </w:rPr>
-              <w:t xml:space="preserve">측정 RT. 0 이상 숫자</w:t>
-            </w:r>
-          </w:p>
-        </w:tc>
-        <w:tc>
-          <w:tcPr>
-            <w:tcW w:type="dxa" w:w="2376"/>
-            <w:tcMar>
-              <w:top w:type="dxa" w:w="60"/>
-              <w:left w:type="dxa" w:w="90"/>
-              <w:bottom w:type="dxa" w:w="60"/>
-              <w:right w:type="dxa" w:w="90"/>
-            </w:tcMar>
-          </w:tcPr>
-          <w:p>
-            <w:r>
-              <w:rPr>
-                <w:sz w:val="18"/>
-                <w:szCs w:val="18"/>
-              </w:rPr>
-              <w:t xml:space="preserve">2.10</w:t>
+            <w:tcW w:type="dxa" w:w="1800"/>
+            <w:tcMar>
+              <w:top w:type="dxa" w:w="60"/>
+              <w:left w:type="dxa" w:w="90"/>
+              <w:bottom w:type="dxa" w:w="60"/>
+              <w:right w:type="dxa" w:w="90"/>
+            </w:tcMar>
+          </w:tcPr>
+          <w:p>
+            <w:r>
+              <w:rPr>
+                <w:sz w:val="18"/>
+                <w:szCs w:val="18"/>
+              </w:rPr>
+              <w:t xml:space="preserve">샘플시트 본문</w:t>
+            </w:r>
+          </w:p>
+        </w:tc>
+        <w:tc>
+          <w:tcPr>
+            <w:tcW w:type="dxa" w:w="3853"/>
+            <w:tcMar>
+              <w:top w:type="dxa" w:w="60"/>
+              <w:left w:type="dxa" w:w="90"/>
+              <w:bottom w:type="dxa" w:w="60"/>
+              <w:right w:type="dxa" w:w="90"/>
+            </w:tcMar>
+          </w:tcPr>
+          <w:p>
+            <w:r>
+              <w:rPr>
+                <w:sz w:val="18"/>
+                <w:szCs w:val="18"/>
+              </w:rPr>
+              <w:t xml:space="preserve">eval_file을 줄 때의 형식입니다. 비워 두면 학습 때 떼어 둔 reserved_test.csv를 쓰므로 따로 만들 필요가 없습니다. 한 행에 화합물 하나와 측정 머무름 시간을 적은 CSV 또는 XLSX 표이며, 첫 행은 열 이름입니다. SMILES(필수): 분자 구조 문자열. RT(필수): 측정 머무름 시간(학습 때와 같은 단위). model_type(필수): 행마다 RP 또는 HILIC이며, 같은 모드의 기본 모델과 사용자 모델을 비교하는 데 씁니다. 학습이나 validation에 쓴 구조가 들어 있으면 멈춥니다.</w:t>
+            </w:r>
+          </w:p>
+        </w:tc>
+        <w:tc>
+          <w:tcPr>
+            <w:tcW w:type="dxa" w:w="3853"/>
+            <w:tcMar>
+              <w:top w:type="dxa" w:w="60"/>
+              <w:left w:type="dxa" w:w="90"/>
+              <w:bottom w:type="dxa" w:w="60"/>
+              <w:right w:type="dxa" w:w="90"/>
+            </w:tcMar>
+          </w:tcPr>
+          <w:p>
+            <w:r>
+              <w:rPr>
+                <w:sz w:val="18"/>
+                <w:szCs w:val="18"/>
+              </w:rPr>
+              <w:t xml:space="preserve">Format of eval_file. When it is empty, the reserved_test.csv held out in training is used, so no table is needed. A CSV or XLSX table with one compound and its measured retention time per row, column names in the first row. SMILES (required): structure string. RT (required): measured retention time (same unit as in training). model_type (required): RP or HILIC per row, used to compare the default and user models of the same mode. The run stops if it holds structures used for training or validation.</w:t>
             </w:r>
           </w:p>
         </w:tc>
@@ -13677,86 +13228,109 @@
       <w:tr>
         <w:tc>
           <w:tcPr>
-            <w:tcW w:type="dxa" w:w="2376"/>
-            <w:tcMar>
-              <w:top w:type="dxa" w:w="60"/>
-              <w:left w:type="dxa" w:w="90"/>
-              <w:bottom w:type="dxa" w:w="60"/>
-              <w:right w:type="dxa" w:w="90"/>
-            </w:tcMar>
-          </w:tcPr>
-          <w:p>
-            <w:r>
-              <w:rPr>
-                <w:sz w:val="18"/>
-                <w:szCs w:val="18"/>
-              </w:rPr>
-              <w:t xml:space="preserve">model_type</w:t>
-            </w:r>
-          </w:p>
-        </w:tc>
-        <w:tc>
-          <w:tcPr>
-            <w:tcW w:type="dxa" w:w="2376"/>
-            <w:tcMar>
-              <w:top w:type="dxa" w:w="60"/>
-              <w:left w:type="dxa" w:w="90"/>
-              <w:bottom w:type="dxa" w:w="60"/>
-              <w:right w:type="dxa" w:w="90"/>
-            </w:tcMar>
-          </w:tcPr>
-          <w:p>
-            <w:r>
-              <w:rPr>
-                <w:sz w:val="18"/>
-                <w:szCs w:val="18"/>
-              </w:rPr>
-              <w:t xml:space="preserve">필수</w:t>
-            </w:r>
-          </w:p>
-        </w:tc>
-        <w:tc>
-          <w:tcPr>
-            <w:tcW w:type="dxa" w:w="2376"/>
-            <w:tcMar>
-              <w:top w:type="dxa" w:w="60"/>
-              <w:left w:type="dxa" w:w="90"/>
-              <w:bottom w:type="dxa" w:w="60"/>
-              <w:right w:type="dxa" w:w="90"/>
-            </w:tcMar>
-          </w:tcPr>
-          <w:p>
-            <w:r>
-              <w:rPr>
-                <w:sz w:val="18"/>
-                <w:szCs w:val="18"/>
-              </w:rPr>
-              <w:t xml:space="preserve">RP 또는 HILIC(행마다). 같은 모드의 모델끼리 비교하는 데 씀</w:t>
-            </w:r>
-          </w:p>
-        </w:tc>
-        <w:tc>
-          <w:tcPr>
-            <w:tcW w:type="dxa" w:w="2376"/>
-            <w:tcMar>
-              <w:top w:type="dxa" w:w="60"/>
-              <w:left w:type="dxa" w:w="90"/>
-              <w:bottom w:type="dxa" w:w="60"/>
-              <w:right w:type="dxa" w:w="90"/>
-            </w:tcMar>
-          </w:tcPr>
-          <w:p>
-            <w:r>
-              <w:rPr>
-                <w:sz w:val="18"/>
-                <w:szCs w:val="18"/>
-              </w:rPr>
-              <w:t xml:space="preserve">RP</w:t>
-            </w:r>
-          </w:p>
+            <w:tcW w:type="dxa" w:w="1800"/>
+            <w:tcMar>
+              <w:top w:type="dxa" w:w="60"/>
+              <w:left w:type="dxa" w:w="90"/>
+              <w:bottom w:type="dxa" w:w="60"/>
+              <w:right w:type="dxa" w:w="90"/>
+            </w:tcMar>
+          </w:tcPr>
+          <w:p>
+            <w:r>
+              <w:rPr>
+                <w:sz w:val="18"/>
+                <w:szCs w:val="18"/>
+              </w:rPr>
+              <w:t xml:space="preserve">샘플시트 예시 제목</w:t>
+            </w:r>
+          </w:p>
+        </w:tc>
+        <w:tc>
+          <w:tcPr>
+            <w:tcW w:type="dxa" w:w="3853"/>
+            <w:tcMar>
+              <w:top w:type="dxa" w:w="60"/>
+              <w:left w:type="dxa" w:w="90"/>
+              <w:bottom w:type="dxa" w:w="60"/>
+              <w:right w:type="dxa" w:w="90"/>
+            </w:tcMar>
+          </w:tcPr>
+          <w:p>
+            <w:r>
+              <w:rPr>
+                <w:sz w:val="18"/>
+                <w:szCs w:val="18"/>
+              </w:rPr>
+              <w:t xml:space="preserve">evaluation.csv</w:t>
+            </w:r>
+          </w:p>
+        </w:tc>
+        <w:tc>
+          <w:tcPr>
+            <w:tcW w:type="dxa" w:w="3853"/>
+            <w:tcMar>
+              <w:top w:type="dxa" w:w="60"/>
+              <w:left w:type="dxa" w:w="90"/>
+              <w:bottom w:type="dxa" w:w="60"/>
+              <w:right w:type="dxa" w:w="90"/>
+            </w:tcMar>
+          </w:tcPr>
+          <w:p/>
         </w:tc>
       </w:tr>
     </w:tbl>
+    <w:p/>
+    <w:p>
+      <w:pPr>
+        <w:spacing w:after="140"/>
+      </w:pPr>
+      <w:r>
+        <w:t xml:space="preserve">샘플시트 예시 본문:</w:t>
+      </w:r>
+    </w:p>
+    <w:p>
+      <w:pPr>
+        <w:shd w:fill="F3F4F6" w:color="auto" w:val="clear"/>
+        <w:spacing w:after="0"/>
+      </w:pPr>
+      <w:r>
+        <w:rPr>
+          <w:color w:val="3A3A3A"/>
+          <w:sz w:val="19"/>
+          <w:szCs w:val="19"/>
+        </w:rPr>
+        <w:t xml:space="preserve">compound_id,SMILES,RT,model_type</w:t>
+      </w:r>
+    </w:p>
+    <w:p>
+      <w:pPr>
+        <w:shd w:fill="F3F4F6" w:color="auto" w:val="clear"/>
+        <w:spacing w:after="0"/>
+      </w:pPr>
+      <w:r>
+        <w:rPr>
+          <w:color w:val="3A3A3A"/>
+          <w:sz w:val="19"/>
+          <w:szCs w:val="19"/>
+        </w:rPr>
+        <w:t xml:space="preserve">E001,CC(=O)O,1.90,RP</w:t>
+      </w:r>
+    </w:p>
+    <w:p>
+      <w:pPr>
+        <w:shd w:fill="F3F4F6" w:color="auto" w:val="clear"/>
+        <w:spacing w:after="0"/>
+      </w:pPr>
+      <w:r>
+        <w:rPr>
+          <w:color w:val="3A3A3A"/>
+          <w:sz w:val="19"/>
+          <w:szCs w:val="19"/>
+        </w:rPr>
+        <w:t xml:space="preserve">E002,OCC(O)CO,3.10,HILIC</w:t>
+      </w:r>
+    </w:p>
     <w:p/>
     <w:p>
       <w:pPr>

</xml_diff>

<commit_message>
RTpred docs: result sections say example data instead of the lab name
Co-Authored-By: Claude Opus 5.5 <noreply@anthropic.com>
</commit_message>
<xml_diff>
--- a/docs/RTpred/modules/Portal_Content.docx
+++ b/docs/RTpred/modules/Portal_Content.docx
@@ -4212,7 +4212,7 @@
         <w:spacing w:after="140"/>
       </w:pPr>
       <w:r>
-        <w:t xml:space="preserve">서울대 예제(</w:t>
+        <w:t xml:space="preserve">예제 데이터(</w:t>
       </w:r>
       <w:r>
         <w:t xml:space="preserve">compounds.csv</w:t>
@@ -9446,7 +9446,7 @@
         <w:spacing w:after="140"/>
       </w:pPr>
       <w:r>
-        <w:t xml:space="preserve">서울대 예제(</w:t>
+        <w:t xml:space="preserve">예제 데이터(</w:t>
       </w:r>
       <w:r>
         <w:t xml:space="preserve">synthetic_training_RP.csv</w:t>
@@ -13924,7 +13924,7 @@
         <w:spacing w:after="140"/>
       </w:pPr>
       <w:r>
-        <w:t xml:space="preserve">서울대 예제(RP 합성 RT 학습 결과의 reserved_test, scope=all) 결과입니다.</w:t>
+        <w:t xml:space="preserve">예제 데이터(RP 합성 RT 학습 결과의 reserved_test, scope=all) 결과입니다.</w:t>
       </w:r>
     </w:p>
     <w:p>

</xml_diff>

<commit_message>
RTpred: own module concept figures matching per-mode behaviour
The received concept figures show default-only prediction, one model per
training run and several user bundles in comparison. New A/B/C figures in
the style of the other pipelines (docs/RTpred/modules/figures/
module_concepts/, with generator) show the model choice per row and
no_trained_model rows (predict), the split by mode and one model per mode
(train), and per-mode comparison of pre-trained and user models (compare).
Layout follows the Retip workflow and the use of predicted RT to narrow
candidates (METLIN SMRT); no published figure is copied. Legends rewritten;
the received figures stay in docs/RTpred/images/. Word files, portal images
and the 2026-10-23 release folder (not yet deployed) rebuilt.

Co-Authored-By: Claude Opus 5.5 <noreply@anthropic.com>
</commit_message>
<xml_diff>
--- a/docs/RTpred/modules/Portal_Content.docx
+++ b/docs/RTpred/modules/Portal_Content.docx
@@ -339,13 +339,25 @@
         <w:spacing w:after="80"/>
       </w:pPr>
       <w:r>
-        <w:t xml:space="preserve">분석 개념 이미지와 주요 결과 이미지는 서울대가 만든 그림(</w:t>
+        <w:t xml:space="preserve">분석 개념 이미지는 지금 동작(모드별 학습·예측·비교)에 맞춰 직접 그린 그림(</w:t>
+      </w:r>
+      <w:r>
+        <w:t xml:space="preserve">docs/RTpred/modules/figures/module_concepts/</w:t>
+      </w:r>
+      <w:r>
+        <w:t xml:space="preserve">, 생성 스크립트 포함)이고, 주요 결과 이미지는 서울대가 만든 그림(</w:t>
       </w:r>
       <w:r>
         <w:t xml:space="preserve">docs/RTpred/images/</w:t>
       </w:r>
       <w:r>
-        <w:t xml:space="preserve">)입니다. 결과 그림은 서울대 예제 실행 결과이며, 학습·비교 예제의 RT는 기능 확인용 합성값입니다.</w:t>
+        <w:t xml:space="preserve">)입니다. 서울대 개념도(</w:t>
+      </w:r>
+      <w:r>
+        <w:t xml:space="preserve">docs/RTpred/images/module*_concept.png</w:t>
+      </w:r>
+      <w:r>
+        <w:t xml:space="preserve">)는 받은 자료로 그대로 둡니다. 결과 그림은 서울대 예제 실행 결과이며, 학습·비교 예제의 RT는 기능 확인용 합성값입니다.</w:t>
       </w:r>
     </w:p>
     <w:p>
@@ -3998,7 +4010,7 @@
           <w:sz w:val="18"/>
           <w:szCs w:val="18"/>
         </w:rPr>
-        <w:t xml:space="preserve">docs/RTpred/images/module1_concept.png</w:t>
+        <w:t xml:space="preserve">docs/RTpred/modules/figures/module_concepts/rtpred_predict_concept.png</w:t>
       </w:r>
     </w:p>
     <w:p>
@@ -4009,7 +4021,7 @@
       <w:r>
         <w:drawing>
           <wp:inline distT="0" distB="0" distL="0" distR="0">
-            <wp:extent cx="5715000" cy="1895475"/>
+            <wp:extent cx="5715000" cy="2362200"/>
             <wp:effectExtent t="0" r="0" b="0" l="0"/>
             <wp:docPr id="1" name="" descr="" title=""/>
             <wp:cNvGraphicFramePr>
@@ -4034,7 +4046,7 @@
                   <pic:spPr bwMode="auto">
                     <a:xfrm>
                       <a:off x="0" y="0"/>
-                      <a:ext cx="5715000" cy="1895475"/>
+                      <a:ext cx="5715000" cy="2362200"/>
                     </a:xfrm>
                     <a:prstGeom prst="rect">
                       <a:avLst/>
@@ -4064,10 +4076,10 @@
           <w:b/>
           <w:bCs/>
         </w:rPr>
-        <w:t xml:space="preserve">그림. 기본 모델로 머무름 시간 예측.</w:t>
-      </w:r>
-      <w:r>
-        <w:t xml:space="preserve"> (Compound input) CSV 또는 XLSX 화합물 표에서 SMILES와 RP·HILIC 모드를 읽으며, 측정 RT는 있어도 되고 없어도 됩니다. (Local best ensemble) 구조를 RDKit descriptor로 바꾸고 이미지에 저장된 best 앙상블(WeightedEnsemble_L3)로 예측합니다. (Predicted RT) 입력 한 행마다 결과 한 행을 내며, 읽지 못한 구조도 결과에 남기고 예측표·QC·분포 그림을 만듭니다.</w:t>
+        <w:t xml:space="preserve">그림. 행마다 맞는 모델로 머무름 시간 예측.</w:t>
+      </w:r>
+      <w:r>
+        <w:t xml:space="preserve"> (A) 예측할 화합물 목록은 한 행에 화합물 하나와 그 분리 모드(model_type: RP 또는 HILIC)를 적으며, 두 모드를 섞을 수 있습니다. 측정 RT가 있으면 ΔRT(측정 - 예측)도 계산합니다. (B) model_dir을 비우면 이미지에 들어 있는 사전 학습 RP·HILIC 모델로, rtpred_train 결과 폴더를 주면 그 사용자 모델로 예측하며, 행마다 자기 모드의 모델을 씁니다. 사용자 모델에서 학습하지 않은 모드(점선)의 행은 예측하지 않습니다. (C) 결과 표에는 행마다 예측 RT와 상태가 적히며, 학습하지 않은 모드의 행은 no_trained_model로 남습니다. 예측 RT는 같은 m/z 후보 가운데 측정 RT 근처(초록 범위)에 있는 것을 고르는 데 씁니다. 값과 구조는 모식적인 값입니다.</w:t>
       </w:r>
     </w:p>
     <w:p>
@@ -4087,10 +4099,10 @@
           <w:b/>
           <w:bCs/>
         </w:rPr>
-        <w:t xml:space="preserve">Figure. Retention time prediction with the default models.</w:t>
-      </w:r>
-      <w:r>
-        <w:t xml:space="preserve"> (Compound input) SMILES and the RP or HILIC mode are read from a CSV or XLSX table; a measured RT is optional. (Local best ensemble) Structures become RDKit descriptors and the best ensemble saved in the image (WeightedEnsemble_L3) predicts. (Predicted RT) Each input row gives one result row; unreadable structures are kept, and a prediction table, QC and distribution plots are written.</w:t>
+        <w:t xml:space="preserve">Figure. Retention time prediction with the model of each row.</w:t>
+      </w:r>
+      <w:r>
+        <w:t xml:space="preserve"> (A) The compound list gives one compound per row with its separation mode (model_type: RP or HILIC); modes may be mixed, and a measured RT adds ΔRT (measured - predicted). (B) With model_dir empty, the pre-trained RP and HILIC models in the image predict; with a rtpred_train output folder, its user models predict. Each row uses the model of its own mode, and rows of a mode the user did not train (dashed) are not predicted. (C) The result table gives the predicted RT and status of every row; rows of an untrained mode are kept as no_trained_model. The predicted RT helps keep, among candidates of one m/z, those near the measured RT (green range). Values and structures are schematic.</w:t>
       </w:r>
     </w:p>
     <w:p>
@@ -4103,7 +4115,7 @@
         <w:spacing w:after="80"/>
       </w:pPr>
       <w:r>
-        <w:t xml:space="preserve">출처: 서울대 식품대사체학 연구실 제공 모식도(외부 논문 그림 사용 안 함)</w:t>
+        <w:t xml:space="preserve">출처: 직접 작성한 모식도(외부 그림 사용 안 함). 구성 참고: Retip(Bonini 외, Anal Chem 2020)의 RT 예측 흐름, METLIN SMRT(Domingo-Almenara 외, Nat Commun 2019)의 예측 RT로 후보 거르기</w:t>
       </w:r>
     </w:p>
     <w:p>
@@ -9120,7 +9132,7 @@
           <w:sz w:val="18"/>
           <w:szCs w:val="18"/>
         </w:rPr>
-        <w:t xml:space="preserve">docs/RTpred/images/module2_concept.png</w:t>
+        <w:t xml:space="preserve">docs/RTpred/modules/figures/module_concepts/rtpred_train_concept.png</w:t>
       </w:r>
     </w:p>
     <w:p>
@@ -9131,7 +9143,7 @@
       <w:r>
         <w:drawing>
           <wp:inline distT="0" distB="0" distL="0" distR="0">
-            <wp:extent cx="5715000" cy="1895475"/>
+            <wp:extent cx="5715000" cy="2362200"/>
             <wp:effectExtent t="0" r="0" b="0" l="0"/>
             <wp:docPr id="3" name="" descr="" title=""/>
             <wp:cNvGraphicFramePr>
@@ -9156,7 +9168,7 @@
                   <pic:spPr bwMode="auto">
                     <a:xfrm>
                       <a:off x="0" y="0"/>
-                      <a:ext cx="5715000" cy="1895475"/>
+                      <a:ext cx="5715000" cy="2362200"/>
                     </a:xfrm>
                     <a:prstGeom prst="rect">
                       <a:avLst/>
@@ -9186,10 +9198,10 @@
           <w:b/>
           <w:bCs/>
         </w:rPr>
-        <w:t xml:space="preserve">그림. 사용자 머무름 시간 모델 학습.</w:t>
-      </w:r>
-      <w:r>
-        <w:t xml:space="preserve"> (Measured library) SMILES와 측정 RT 표를 정규화한 구조 단위로 묶고, 학습 전에 예약 test 화합물을 먼저 떼어 둡니다. (Train and select) descriptor 필터는 train에서만 정하고, pyRetip 방식의 학습 인터페이스로 후보 모델을 학습한 뒤 validation RMSE로 best를 고릅니다. (Reusable models) AutoGluon 모델과 manifest, 학습 구조 해시, 학습에 쓰지 않은 예약 test CSV를 저장합니다.</w:t>
+        <w:t xml:space="preserve">그림. 분리 모드마다 사용자 머무름 시간 모델 학습.</w:t>
+      </w:r>
+      <w:r>
+        <w:t xml:space="preserve"> (A) 측정 RT 표를 model_type에 따라 RP 행과 HILIC 행으로 나눕니다. 모드마다 정제 후 25행, 서로 다른 구조 15개 이상이 필요하며, 한 모드의 자료는 같은 컬럼, 이동상, gradient로 측정한 것이어야 합니다. (B) 모드마다 같은 구조가 두 분할에 들어가지 않도록 구조 단위로 train, validation, 예약 test로 나누고, AutoGluon 후보 모델을 학습해 validation RMSE가 가장 낮은 모델을 best로 고릅니다. (C) 모드마다 result/RP/, result/HILIC/에 모델, 예약 test, leaderboard가 저장되고, train_summary.tsv에 모드별 상태가 남습니다. 이 결과 폴더는 rtpred_predict와 rtpred_compare의 입력입니다. 값은 모식적인 값입니다.</w:t>
       </w:r>
     </w:p>
     <w:p>
@@ -9209,10 +9221,10 @@
           <w:b/>
           <w:bCs/>
         </w:rPr>
-        <w:t xml:space="preserve">Figure. Training a user retention time model.</w:t>
-      </w:r>
-      <w:r>
-        <w:t xml:space="preserve"> (Measured library) The table of SMILES and measured RT is grouped by canonical structure, and reserved test compounds are set aside before training. (Train and select) Descriptor filters are fitted on train only, candidate models are trained through the pyRetip-style interface, and the best is chosen by validation RMSE. (Reusable models) AutoGluon models with a manifest, training structure hashes and the unused reserved test CSV are saved.</w:t>
+        <w:t xml:space="preserve">Figure. Training a user retention time model per separation mode.</w:t>
+      </w:r>
+      <w:r>
+        <w:t xml:space="preserve"> (A) The measured RT table is split by model_type into RP and HILIC rows. Each mode needs at least 25 rows and 15 distinct structures after cleaning, measured with one column, mobile phase and gradient. (B) For each mode the rows are split by structure into train, validation and a reserved test so that no structure falls in two splits, AutoGluon candidate models are trained, and the one with the lowest validation RMSE is kept as best. (C) Each mode is saved in result/RP/ or result/HILIC/ with its models, reserved test and leaderboard, and train_summary.tsv lists the status per mode; the output folder is the input of rtpred_predict and rtpred_compare. Values are schematic.</w:t>
       </w:r>
     </w:p>
     <w:p>
@@ -9225,7 +9237,7 @@
         <w:spacing w:after="80"/>
       </w:pPr>
       <w:r>
-        <w:t xml:space="preserve">출처: 서울대 식품대사체학 연구실 제공 모식도(외부 논문 그림 사용 안 함)</w:t>
+        <w:t xml:space="preserve">출처: 직접 작성한 모식도(외부 그림 사용 안 함). 구성 참고: Retip(Bonini 외, Anal Chem 2020)의 RT 예측 흐름, METLIN SMRT(Domingo-Almenara 외, Nat Commun 2019)의 예측 RT로 후보 거르기</w:t>
       </w:r>
     </w:p>
     <w:p>
@@ -13668,7 +13680,7 @@
           <w:sz w:val="18"/>
           <w:szCs w:val="18"/>
         </w:rPr>
-        <w:t xml:space="preserve">docs/RTpred/images/module3_concept.png</w:t>
+        <w:t xml:space="preserve">docs/RTpred/modules/figures/module_concepts/rtpred_compare_concept.png</w:t>
       </w:r>
     </w:p>
     <w:p>
@@ -13679,7 +13691,7 @@
       <w:r>
         <w:drawing>
           <wp:inline distT="0" distB="0" distL="0" distR="0">
-            <wp:extent cx="5715000" cy="1895475"/>
+            <wp:extent cx="5715000" cy="2362200"/>
             <wp:effectExtent t="0" r="0" b="0" l="0"/>
             <wp:docPr id="5" name="" descr="" title=""/>
             <wp:cNvGraphicFramePr>
@@ -13704,7 +13716,7 @@
                   <pic:spPr bwMode="auto">
                     <a:xfrm>
                       <a:off x="0" y="0"/>
-                      <a:ext cx="5715000" cy="1895475"/>
+                      <a:ext cx="5715000" cy="2362200"/>
                     </a:xfrm>
                     <a:prstGeom prst="rect">
                       <a:avLst/>
@@ -13734,10 +13746,10 @@
           <w:b/>
           <w:bCs/>
         </w:rPr>
-        <w:t xml:space="preserve">그림. 기본 모델과 사용자 모델의 성능 비교.</w:t>
-      </w:r>
-      <w:r>
-        <w:t xml:space="preserve"> (Common evaluation set) SMILES와 측정 RT 평가 표에서 사용자 학습 자료와의 중복을 확인하고, 모든 모델을 같은 유효 행으로 평가합니다. (Models to compare) 이미지의 기본 best 모델과 사용자 모델(모든 후보 또는 best)을 비교합니다. (Performance comparison) RMSE, MAE, R²와 순위표, 측정-예측 그림을 만들며, 기본 모델은 바뀌지 않습니다.</w:t>
+        <w:t xml:space="preserve">그림. 같은 모드의 사전 학습 모델과 사용자 모델 비교.</w:t>
+      </w:r>
+      <w:r>
+        <w:t xml:space="preserve"> (A) 평가 행은 모드마다 학습 때 떼어 둔 reserved_test.csv가 기본이며, model_type 열이 있는 별도 평가 표를 줄 수도 있습니다. 학습이나 validation에 쓴 구조가 들어 있으면 멈춥니다. (B) 모드마다 같은 평가 행으로 사전 학습 모델과 사용자 모델을 비교하며, RP와 HILIC는 서로 비교하지 않습니다. (C) 후보마다 RMSE, MAE, R²와 순위, 측정-예측 RT 그림을 만들고, 모드 열이 붙은 comparison.csv로 모읍니다. 사전 학습 모델은 바뀌지 않습니다. 막대 값은 모식적인 값입니다.</w:t>
       </w:r>
     </w:p>
     <w:p>
@@ -13757,10 +13769,10 @@
           <w:b/>
           <w:bCs/>
         </w:rPr>
-        <w:t xml:space="preserve">Figure. Comparing the default and user models.</w:t>
-      </w:r>
-      <w:r>
-        <w:t xml:space="preserve"> (Common evaluation set) The evaluation table of SMILES and measured RT is checked for overlap with the user training data, and every model is evaluated on the same valid rows. (Models to compare) The default best model of the image is compared with the user model (all candidates or the best). (Performance comparison) RMSE, MAE, R², a rank table and a measured-versus-predicted plot are produced; the default model stays unchanged.</w:t>
+        <w:t xml:space="preserve">Figure. Comparing the pre-trained and user models of the same mode.</w:t>
+      </w:r>
+      <w:r>
+        <w:t xml:space="preserve"> (A) The evaluation rows are, by default, the reserved_test.csv held out per mode in training; a separate evaluation table with a model_type column can be given. Structures used for training or validation stop the run. (B) For each mode the pre-trained and user models are compared on the same evaluation rows; RP and HILIC are never compared with each other. (C) RMSE, MAE, R², a rank and a measured-versus-predicted RT plot are produced per candidate and joined in comparison.csv with a mode column; the pre-trained models stay unchanged. Bar values are schematic.</w:t>
       </w:r>
     </w:p>
     <w:p>
@@ -13773,7 +13785,7 @@
         <w:spacing w:after="80"/>
       </w:pPr>
       <w:r>
-        <w:t xml:space="preserve">출처: 서울대 식품대사체학 연구실 제공 모식도(외부 논문 그림 사용 안 함)</w:t>
+        <w:t xml:space="preserve">출처: 직접 작성한 모식도(외부 그림 사용 안 함). 구성 참고: Retip(Bonini 외, Anal Chem 2020)의 RT 예측 흐름, METLIN SMRT(Domingo-Almenara 외, Nat Commun 2019)의 예측 RT로 후보 거르기</w:t>
       </w:r>
     </w:p>
     <w:p>

</xml_diff>

<commit_message>
RTpred figures: two panels where the third repeated another
The predict figure 2 drops the enlarged-peak panel (the peak is marked in
the scatter), and the compare figure merges the evaluation-rows text with
the same-mode pairing. Legends follow; Word, portal images and the
2026-10-23 release folder rebuilt.

Co-Authored-By: Claude Opus 5.5 <noreply@anthropic.com>
</commit_message>
<xml_diff>
--- a/docs/RTpred/modules/Portal_Content.docx
+++ b/docs/RTpred/modules/Portal_Content.docx
@@ -4215,7 +4215,7 @@
         <w:t xml:space="preserve">그림 2. 예측 머무름 시간 오차로 후보 순위 매기기.</w:t>
       </w:r>
       <w:r>
-        <w:t xml:space="preserve"> (A) 구조를 아는 화합물들의 예측 RT(가로)와 측정 RT(세로)이며, 점선은 예측과 측정이 같은 선입니다. (B) annotation할 MS 피크(M+H, m/z 168.0423) 하나를 확대한 것으로, 점선에서 떨어진 거리가 예측 RT 오차입니다. (C) 같은 m/z를 가진 후보들을 예측 RT 오차가 작은 순서로 세우면 정답(1, vanillic acid)이 맨 위에 옵니다. 값은 모식적인 값입니다. Domingo-Almenara 외, Nat Commun 2019, Fig. 4를 수정(CC BY 4.0).</w:t>
+        <w:t xml:space="preserve"> (A) 구조를 아는 화합물들의 예측 RT(가로)와 측정 RT(세로)이며, 점선은 예측과 측정이 같은 선입니다. annotation할 피크(빨강, m/z 168.0423)가 점선에서 떨어진 거리가 예측 RT 오차입니다. (B) 같은 m/z를 가진 후보들을 예측 RT 오차가 작은 순서로 세우면 정답(1, vanillic acid)이 맨 위에 옵니다. 값은 모식적인 값입니다. Domingo-Almenara 외, Nat Commun 2019, Fig. 4를 수정(CC BY 4.0).</w:t>
       </w:r>
     </w:p>
     <w:p>
@@ -4238,7 +4238,7 @@
         <w:t xml:space="preserve">Figure 2. Ranking candidates by predicted retention time error.</w:t>
       </w:r>
       <w:r>
-        <w:t xml:space="preserve"> (A) Predicted (x) and measured (y) RTs of compounds with known structures; the dashed line is predicted = measured. (B) One MS peak to annotate (M+H, m/z 168.0423), enlarged; its distance from the dashed line is the predicted RT error. (C) Candidates with the same m/z, ordered by predicted RT error, put the correct one (1, vanillic acid) first. Values are schematic. Adapted from Domingo-Almenara et al., Nat Commun 2019, Fig. 4 (CC BY 4.0).</w:t>
+        <w:t xml:space="preserve"> (A) Predicted (x) and measured (y) RTs of compounds with known structures; the dashed line is predicted = measured, and the distance of the peak to annotate (red, m/z 168.0423) from it is the predicted RT error. (B) Candidates with the same m/z, ordered by predicted RT error, put the correct one (1, vanillic acid) first. Values are schematic. Adapted from Domingo-Almenara et al., Nat Commun 2019, Fig. 4 (CC BY 4.0).</w:t>
       </w:r>
     </w:p>
     <w:p>
@@ -14041,7 +14041,7 @@
         <w:t xml:space="preserve">그림. 같은 모드의 사전 학습 모델과 사용자 모델 비교.</w:t>
       </w:r>
       <w:r>
-        <w:t xml:space="preserve"> (A) 평가 행은 모드마다 학습 때 떼어 둔 reserved_test.csv가 기본이며, model_type 열이 있는 별도 평가 표를 줄 수도 있습니다. 학습이나 validation에 쓴 구조가 들어 있으면 멈춥니다. (B) 모드마다 같은 평가 행으로 사전 학습 모델과 사용자 모델을 비교하며, RP와 HILIC는 서로 비교하지 않습니다. (C) 후보마다 RMSE, MAE, R²와 순위, 측정-예측 RT 그림을 만들고, 모드 열이 붙은 comparison.csv로 모읍니다. 사전 학습 모델은 바뀌지 않습니다. 막대 값은 모식적인 값입니다.</w:t>
+        <w:t xml:space="preserve"> (A) 모드마다 같은 평가 행으로 사전 학습 모델과 사용자 모델을 비교합니다. 평가 행은 모드마다 학습 때 떼어 둔 reserved_test.csv가 기본이며, model_type 열이 있는 별도 평가 표를 줄 수도 있습니다. RP와 HILIC는 서로 비교하지 않고, 학습이나 validation에 쓴 구조가 들어 있으면 멈춥니다. (B) 후보마다 RMSE, MAE, R²와 순위, 측정-예측 RT 그림을 만들고, 모드 열이 붙은 comparison.csv로 모읍니다. 사전 학습 모델은 바뀌지 않습니다. 막대 값은 모식적인 값입니다.</w:t>
       </w:r>
     </w:p>
     <w:p>
@@ -14064,7 +14064,7 @@
         <w:t xml:space="preserve">Figure. Comparing the pre-trained and user models of the same mode.</w:t>
       </w:r>
       <w:r>
-        <w:t xml:space="preserve"> (A) The evaluation rows are, by default, the reserved_test.csv held out per mode in training; a separate evaluation table with a model_type column can be given. Structures used for training or validation stop the run. (B) For each mode the pre-trained and user models are compared on the same evaluation rows; RP and HILIC are never compared with each other. (C) RMSE, MAE, R², a rank and a measured-versus-predicted RT plot are produced per candidate and joined in comparison.csv with a mode column; the pre-trained models stay unchanged. Bar values are schematic.</w:t>
+        <w:t xml:space="preserve"> (A) For each mode the pre-trained and user models are compared on the same evaluation rows: by default the reserved_test.csv held out per mode in training, or a separate evaluation table with a model_type column. RP and HILIC are never compared with each other, and structures used for training or validation stop the run. (B) RMSE, MAE, R², a rank and a measured-versus-predicted RT plot are produced per candidate and joined in comparison.csv with a mode column; the pre-trained models stay unchanged. Bar values are schematic.</w:t>
       </w:r>
     </w:p>
     <w:p>

</xml_diff>

<commit_message>
Portal subtitles: 10-20 characters; RTpred subtitles shortened
The portal guide records the subtitle length rule (10-20 characters, never
over 20). RTpred: rtpred_compare becomes 사전 학습·사용자 모델 비교 and the
pipeline 머무름 시간 예측과 모델 학습. Word files and the 2026-10-23 release
folder rebuilt.

Co-Authored-By: Claude Opus 5.5 <noreply@anthropic.com>
</commit_message>
<xml_diff>
--- a/docs/RTpred/modules/Portal_Content.docx
+++ b/docs/RTpred/modules/Portal_Content.docx
@@ -10009,27 +10009,27 @@
                 <w:sz w:val="18"/>
                 <w:szCs w:val="18"/>
               </w:rPr>
-              <w:t xml:space="preserve">기본·사용자 머무름 시간 모델 성능 비교</w:t>
-            </w:r>
-          </w:p>
-        </w:tc>
-        <w:tc>
-          <w:tcPr>
-            <w:tcW w:type="dxa" w:w="3853"/>
-            <w:tcMar>
-              <w:top w:type="dxa" w:w="60"/>
-              <w:left w:type="dxa" w:w="90"/>
-              <w:bottom w:type="dxa" w:w="60"/>
-              <w:right w:type="dxa" w:w="90"/>
-            </w:tcMar>
-          </w:tcPr>
-          <w:p>
-            <w:r>
-              <w:rPr>
-                <w:sz w:val="18"/>
-                <w:szCs w:val="18"/>
-              </w:rPr>
-              <w:t xml:space="preserve">Default and user RT model comparison</w:t>
+              <w:t xml:space="preserve">사전 학습·사용자 모델 비교</w:t>
+            </w:r>
+          </w:p>
+        </w:tc>
+        <w:tc>
+          <w:tcPr>
+            <w:tcW w:type="dxa" w:w="3853"/>
+            <w:tcMar>
+              <w:top w:type="dxa" w:w="60"/>
+              <w:left w:type="dxa" w:w="90"/>
+              <w:bottom w:type="dxa" w:w="60"/>
+              <w:right w:type="dxa" w:w="90"/>
+            </w:tcMar>
+          </w:tcPr>
+          <w:p>
+            <w:r>
+              <w:rPr>
+                <w:sz w:val="18"/>
+                <w:szCs w:val="18"/>
+              </w:rPr>
+              <w:t xml:space="preserve">Pre-trained and user model comparison</w:t>
             </w:r>
           </w:p>
         </w:tc>

</xml_diff>

<commit_message>
Portal tags in English (container tags of all pipelines); guide: no forced three-panel concept figures
Co-Authored-By: Claude Opus 5.5 <noreply@anthropic.com>
</commit_message>
<xml_diff>
--- a/docs/RTpred/modules/Portal_Content.docx
+++ b/docs/RTpred/modules/Portal_Content.docx
@@ -2314,7 +2314,7 @@
         <w:t xml:space="preserve">태그(키워드):</w:t>
       </w:r>
       <w:r>
-        <w:t xml:space="preserve"> 머무름시간예측, 대사체동정, RDKit, AutoGluon</w:t>
+        <w:t xml:space="preserve"> retention time prediction, metabolite identification, RDKit, AutoGluon</w:t>
       </w:r>
     </w:p>
     <w:p>
@@ -6272,7 +6272,7 @@
         <w:t xml:space="preserve">태그(키워드):</w:t>
       </w:r>
       <w:r>
-        <w:t xml:space="preserve"> 머무름시간예측, 대사체동정, RDKit, AutoGluon</w:t>
+        <w:t xml:space="preserve"> retention time prediction, metabolite identification, RDKit, AutoGluon</w:t>
       </w:r>
     </w:p>
     <w:p>
@@ -11720,7 +11720,7 @@
         <w:t xml:space="preserve">태그(키워드):</w:t>
       </w:r>
       <w:r>
-        <w:t xml:space="preserve"> 머무름시간예측, 대사체동정, RDKit, AutoGluon</w:t>
+        <w:t xml:space="preserve"> retention time prediction, metabolite identification, RDKit, AutoGluon</w:t>
       </w:r>
     </w:p>
     <w:p>

</xml_diff>